<commit_message>
test JNZ fini, 1st test sur BM2
</commit_message>
<xml_diff>
--- a/renders/DC_JNZ_2026_GLOBAL_transformed_generated.docx
+++ b/renders/DC_JNZ_2026_GLOBAL_transformed_generated.docx
@@ -79,101 +79,49 @@
     </w:p>
     <w:p>
       <w:pPr>
-        <w:jc w:val="left"/>
+        <w:pStyle w:val="DCNormal"/>
+      </w:pPr>
+      <w:r/>
+    </w:p>
+    <w:p>
+      <w:pPr>
+        <w:pStyle w:val="DCHDC"/>
       </w:pPr>
       <w:r>
         <w:rPr>
-          <w:rFonts w:ascii="Times New Roman" w:hAnsi="Times New Roman"/>
-          <w:color w:val="000000"/>
-          <w:sz w:val="20"/>
-        </w:rPr>
-      </w:r>
-    </w:p>
-    <w:p>
-      <w:pPr>
-        <w:jc w:val="left"/>
-      </w:pPr>
-    </w:p>
-    <w:p>
-      <w:pPr>
-        <w:jc w:val="left"/>
-      </w:pPr>
-    </w:p>
-    <w:p>
-      <w:pPr>
-        <w:jc w:val="left"/>
-      </w:pPr>
-    </w:p>
-    <w:p>
-      <w:pPr>
-        <w:jc w:val="left"/>
-      </w:pPr>
-    </w:p>
-    <w:p>
-      <w:pPr>
-        <w:pStyle w:val="DCHDC"/>
-        <w:jc w:val="center"/>
-      </w:pPr>
-      <w:r>
-        <w:rPr>
-          <w:rFonts w:ascii="Arial" w:hAnsi="Arial"/>
           <w:b/>
-          <w:color w:val="538CD3"/>
-          <w:sz w:val="40"/>
         </w:rPr>
         <w:t>DOSSIER DE COMPETENCES</w:t>
       </w:r>
     </w:p>
     <w:p>
       <w:pPr>
-        <w:jc w:val="left"/>
-      </w:pPr>
-    </w:p>
-    <w:p>
-      <w:pPr>
-        <w:jc w:val="left"/>
-      </w:pPr>
-    </w:p>
-    <w:p>
-      <w:pPr>
-        <w:jc w:val="left"/>
-      </w:pPr>
-    </w:p>
-    <w:p>
-      <w:pPr>
-        <w:jc w:val="left"/>
+        <w:pStyle w:val="DCNormal"/>
       </w:pPr>
     </w:p>
     <w:p>
       <w:pPr>
         <w:pStyle w:val="DCHTrigramme"/>
-        <w:jc w:val="center"/>
       </w:pPr>
       <w:r>
         <w:rPr>
-          <w:rFonts w:ascii="Arial" w:hAnsi="Arial"/>
           <w:b/>
-          <w:color w:val="F69545"/>
-          <w:sz w:val="40"/>
         </w:rPr>
         <w:t>JNZ</w:t>
       </w:r>
     </w:p>
     <w:p>
       <w:pPr>
-        <w:jc w:val="left"/>
+        <w:pStyle w:val="DCNormal"/>
       </w:pPr>
     </w:p>
     <w:p>
       <w:pPr>
         <w:pStyle w:val="DCHPoste"/>
-        <w:jc w:val="center"/>
       </w:pPr>
       <w:r>
         <w:rPr>
-          <w:rFonts w:ascii="Arial" w:hAnsi="Arial"/>
           <w:b/>
-          <w:sz w:val="40"/>
         </w:rPr>
         <w:t>Data Engineer, Data Analyst</w:t>
       </w:r>
@@ -181,51 +129,22 @@
     <w:p>
       <w:pPr>
         <w:pStyle w:val="DCHPoste"/>
-        <w:jc w:val="center"/>
       </w:pPr>
       <w:r>
         <w:rPr>
-          <w:rFonts w:ascii="Arial" w:hAnsi="Arial"/>
           <w:b/>
-          <w:sz w:val="40"/>
         </w:rPr>
         <w:t>Python, SQL, PostgreSQL, DBT</w:t>
       </w:r>
     </w:p>
     <w:p>
       <w:pPr>
-        <w:jc w:val="left"/>
-      </w:pPr>
-    </w:p>
-    <w:p>
-      <w:pPr>
-        <w:jc w:val="left"/>
-      </w:pPr>
-    </w:p>
-    <w:p>
-      <w:pPr>
-        <w:jc w:val="left"/>
-      </w:pPr>
-    </w:p>
-    <w:p>
-      <w:pPr>
-        <w:jc w:val="left"/>
-      </w:pPr>
-    </w:p>
-    <w:p>
-      <w:pPr>
-        <w:jc w:val="left"/>
-      </w:pPr>
-    </w:p>
-    <w:p>
-      <w:pPr>
-        <w:jc w:val="left"/>
-      </w:pPr>
-    </w:p>
-    <w:p>
-      <w:pPr>
-        <w:pStyle w:val="DCHPoste"/>
-        <w:jc w:val="center"/>
+        <w:pStyle w:val="DCNormal"/>
+      </w:pPr>
+    </w:p>
+    <w:p>
+      <w:pPr>
+        <w:pStyle w:val="DCHXP"/>
         <w:sectPr>
           <w:type w:val="nextPage"/>
           <w:pgSz w:w="11920" w:h="16840" w:orient="portrait"/>
@@ -234,10 +153,7 @@
       </w:pPr>
       <w:r>
         <w:rPr>
-          <w:rFonts w:ascii="Arial" w:hAnsi="Arial"/>
           <w:b/>
-          <w:color w:val="F69545"/>
-          <w:sz w:val="40"/>
         </w:rPr>
         <w:t>Expérience (I2)</w:t>
       </w:r>
@@ -245,204 +161,122 @@
     <w:p>
       <w:pPr>
         <w:pStyle w:val="DCT1Sections"/>
-        <w:jc w:val="left"/>
+      </w:pPr>
+      <w:r>
+        <w:t>Domaines de compétences</w:t>
+      </w:r>
+    </w:p>
+    <w:p>
+      <w:pPr>
+        <w:pStyle w:val="DC1stbullet"/>
+      </w:pPr>
+      <w:r>
+        <w:t>Gestion de projets</w:t>
+      </w:r>
+    </w:p>
+    <w:p>
+      <w:pPr>
+        <w:pStyle w:val="DC2ndbullet"/>
+      </w:pPr>
+      <w:r>
+        <w:t>Recueil des besoins</w:t>
+      </w:r>
+    </w:p>
+    <w:p>
+      <w:pPr>
+        <w:pStyle w:val="DC2ndbullet"/>
+      </w:pPr>
+      <w:r>
+        <w:t>Participation au cahier des charges avec les métiers</w:t>
+      </w:r>
+    </w:p>
+    <w:p>
+      <w:pPr>
+        <w:pStyle w:val="DC2ndbullet"/>
+      </w:pPr>
+      <w:r>
+        <w:t>Analyse de faisabilité et préconisations</w:t>
+      </w:r>
+    </w:p>
+    <w:p>
+      <w:pPr>
+        <w:pStyle w:val="DC2ndbullet"/>
+      </w:pPr>
+      <w:r>
+        <w:t>Gestion des priorités et planning</w:t>
+      </w:r>
+    </w:p>
+    <w:p>
+      <w:pPr>
+        <w:pStyle w:val="DC2ndbullet"/>
+      </w:pPr>
+      <w:r>
+        <w:t>Ecriture des livrables</w:t>
+      </w:r>
+    </w:p>
+    <w:p>
+      <w:pPr>
+        <w:pStyle w:val="DC2ndbullet"/>
+      </w:pPr>
+      <w:r>
+        <w:t>Suivi de projets et avancements</w:t>
+      </w:r>
+    </w:p>
+    <w:p>
+      <w:pPr>
+        <w:pStyle w:val="DC2ndbullet"/>
+      </w:pPr>
+      <w:r>
+        <w:t>Organisation des réunions</w:t>
+      </w:r>
+    </w:p>
+    <w:p>
+      <w:pPr>
+        <w:pStyle w:val="DC2ndbullet"/>
+      </w:pPr>
+      <w:r>
+        <w:t>Coordination transverse entre services</w:t>
+      </w:r>
+    </w:p>
+    <w:p>
+      <w:pPr>
+        <w:pStyle w:val="DC2ndbullet"/>
+      </w:pPr>
+      <w:r>
+        <w:t>Formation des équipes</w:t>
+      </w:r>
+    </w:p>
+    <w:p>
+      <w:pPr>
+        <w:pStyle w:val="DC1stbullet"/>
+      </w:pPr>
+      <w:r>
+        <w:t>Traitement des données</w:t>
+      </w:r>
+    </w:p>
+    <w:p>
+      <w:pPr>
+        <w:pStyle w:val="DC2ndbullet"/>
+      </w:pPr>
+      <w:r>
+        <w:t>Conception de pipelines de données robustes</w:t>
+      </w:r>
+    </w:p>
+    <w:p>
+      <w:pPr>
+        <w:pStyle w:val="DC2ndbullet"/>
+      </w:pPr>
+      <w:r>
+        <w:t>Traitement de données à grande échelle (Big Data):</w:t>
+      </w:r>
+    </w:p>
+    <w:p>
+      <w:pPr>
+        <w:pStyle w:val="DC3rdbullet"/>
       </w:pPr>
       <w:r>
         <w:rPr>
-          <w:color w:val="538CD4"/>
-        </w:rPr>
-        <w:t>Domaines de compétences</w:t>
-      </w:r>
-    </w:p>
-    <w:p>
-      <w:pPr>
-        <w:pStyle w:val="DC1stbullet"/>
-        <w:jc w:val="left"/>
-      </w:pPr>
-      <w:r>
-        <w:rPr>
-          <w:color w:val="EC7C2F"/>
-        </w:rPr>
-        <w:t>Gestion de projets</w:t>
-      </w:r>
-    </w:p>
-    <w:p>
-      <w:pPr>
-        <w:pStyle w:val="DC2ndbullet"/>
-        <w:jc w:val="left"/>
-      </w:pPr>
-      <w:r>
-        <w:rPr>
-          <w:rFonts w:ascii="Arial" w:hAnsi="Arial"/>
-          <w:color w:val="000000"/>
-          <w:sz w:val="20"/>
-        </w:rPr>
-        <w:t>Recueil des besoins</w:t>
-      </w:r>
-    </w:p>
-    <w:p>
-      <w:pPr>
-        <w:pStyle w:val="DC2ndbullet"/>
-        <w:jc w:val="left"/>
-      </w:pPr>
-      <w:r>
-        <w:rPr>
-          <w:rFonts w:ascii="Arial" w:hAnsi="Arial"/>
-          <w:color w:val="000000"/>
-          <w:sz w:val="20"/>
-        </w:rPr>
-        <w:t>Participation au cahier des charges avec les métiers</w:t>
-      </w:r>
-    </w:p>
-    <w:p>
-      <w:pPr>
-        <w:pStyle w:val="DC2ndbullet"/>
-        <w:jc w:val="left"/>
-      </w:pPr>
-      <w:r>
-        <w:rPr>
-          <w:rFonts w:ascii="Arial" w:hAnsi="Arial"/>
-          <w:color w:val="000000"/>
-          <w:sz w:val="20"/>
-        </w:rPr>
-        <w:t>Analyse de faisabilité et préconisations</w:t>
-      </w:r>
-    </w:p>
-    <w:p>
-      <w:pPr>
-        <w:pStyle w:val="DC2ndbullet"/>
-        <w:jc w:val="left"/>
-      </w:pPr>
-      <w:r>
-        <w:rPr>
-          <w:rFonts w:ascii="Arial" w:hAnsi="Arial"/>
-          <w:color w:val="000000"/>
-          <w:sz w:val="20"/>
-        </w:rPr>
-        <w:t>Gestion des priorités et planning</w:t>
-      </w:r>
-    </w:p>
-    <w:p>
-      <w:pPr>
-        <w:pStyle w:val="DC2ndbullet"/>
-        <w:jc w:val="left"/>
-      </w:pPr>
-      <w:r>
-        <w:rPr>
-          <w:rFonts w:ascii="Arial" w:hAnsi="Arial"/>
-          <w:color w:val="000000"/>
-          <w:sz w:val="20"/>
-        </w:rPr>
-        <w:t>Ecriture des livrables</w:t>
-      </w:r>
-    </w:p>
-    <w:p>
-      <w:pPr>
-        <w:pStyle w:val="DC2ndbullet"/>
-        <w:jc w:val="left"/>
-      </w:pPr>
-      <w:r>
-        <w:rPr>
-          <w:rFonts w:ascii="Arial" w:hAnsi="Arial"/>
-          <w:color w:val="000000"/>
-          <w:sz w:val="20"/>
-        </w:rPr>
-        <w:t>Suivi de projets et avancements</w:t>
-      </w:r>
-    </w:p>
-    <w:p>
-      <w:pPr>
-        <w:pStyle w:val="DC2ndbullet"/>
-        <w:jc w:val="left"/>
-      </w:pPr>
-      <w:r>
-        <w:rPr>
-          <w:rFonts w:ascii="Arial" w:hAnsi="Arial"/>
-          <w:color w:val="000000"/>
-          <w:sz w:val="20"/>
-        </w:rPr>
-        <w:t>Organisation des réunions</w:t>
-      </w:r>
-    </w:p>
-    <w:p>
-      <w:pPr>
-        <w:pStyle w:val="DC2ndbullet"/>
-        <w:jc w:val="left"/>
-      </w:pPr>
-      <w:r>
-        <w:rPr>
-          <w:rFonts w:ascii="Arial" w:hAnsi="Arial"/>
-          <w:color w:val="000000"/>
-          <w:sz w:val="20"/>
-        </w:rPr>
-        <w:t>Coordination transverse entre services</w:t>
-      </w:r>
-    </w:p>
-    <w:p>
-      <w:pPr>
-        <w:pStyle w:val="DCT1Sections"/>
-        <w:jc w:val="left"/>
-      </w:pPr>
-      <w:r>
-        <w:rPr>
-          <w:rFonts w:ascii="Arial" w:hAnsi="Arial"/>
-          <w:color w:val="000000"/>
-          <w:sz w:val="20"/>
-        </w:rPr>
-        <w:t>Formation des équipes</w:t>
-      </w:r>
-    </w:p>
-    <w:p>
-      <w:pPr>
-        <w:pStyle w:val="DC1stbullet"/>
-        <w:jc w:val="left"/>
-      </w:pPr>
-      <w:r>
-        <w:rPr>
-          <w:color w:val="EC7C2F"/>
-        </w:rPr>
-        <w:t>Traitement des données</w:t>
-      </w:r>
-    </w:p>
-    <w:p>
-      <w:pPr>
-        <w:pStyle w:val="DC2ndbullet"/>
-        <w:jc w:val="left"/>
-      </w:pPr>
-      <w:r>
-        <w:rPr>
-          <w:rFonts w:ascii="Arial" w:hAnsi="Arial"/>
-          <w:color w:val="000000"/>
-          <w:sz w:val="20"/>
-        </w:rPr>
-        <w:t>Conception de pipelines de données robustes</w:t>
-      </w:r>
-    </w:p>
-    <w:p>
-      <w:pPr>
-        <w:pStyle w:val="DC2ndbullet"/>
-        <w:jc w:val="left"/>
-      </w:pPr>
-      <w:r>
-        <w:rPr>
-          <w:rFonts w:ascii="Arial" w:hAnsi="Arial"/>
-          <w:color w:val="000000"/>
-          <w:sz w:val="20"/>
-        </w:rPr>
-        <w:t>Traitement de données à grande échelle (Big Data):</w:t>
-      </w:r>
-    </w:p>
-    <w:p>
-      <w:pPr>
-        <w:pStyle w:val="DC3rdbullet"/>
-        <w:jc w:val="left"/>
-      </w:pPr>
-      <w:r>
-        <w:rPr>
-          <w:rFonts w:ascii="Arial" w:hAnsi="Arial"/>
           <w:b/>
-          <w:color w:val="000000"/>
-          <w:sz w:val="20"/>
         </w:rPr>
         <w:t>Collecte et branchements APIs, ETLs python</w:t>
       </w:r>
@@ -450,14 +284,10 @@
     <w:p>
       <w:pPr>
         <w:pStyle w:val="DC3rdbullet"/>
-        <w:jc w:val="left"/>
       </w:pPr>
       <w:r>
         <w:rPr>
-          <w:rFonts w:ascii="Arial" w:hAnsi="Arial"/>
           <w:b/>
-          <w:color w:val="000000"/>
-          <w:sz w:val="20"/>
         </w:rPr>
         <w:t>Chargement sur des Data Lakes ou Data Warehouses</w:t>
       </w:r>
@@ -465,29 +295,21 @@
     <w:p>
       <w:pPr>
         <w:pStyle w:val="DC3rdbullet"/>
-        <w:jc w:val="left"/>
       </w:pPr>
       <w:r>
         <w:rPr>
-          <w:rFonts w:ascii="Arial" w:hAnsi="Arial"/>
           <w:b/>
-          <w:color w:val="000000"/>
-          <w:sz w:val="20"/>
         </w:rPr>
         <w:t>Stockage Google Cloud Platform, PostgreSQL, DuckDB</w:t>
       </w:r>
     </w:p>
     <w:p>
       <w:pPr>
-        <w:pStyle w:val="DCT1Sections"/>
-        <w:jc w:val="left"/>
+        <w:pStyle w:val="DC3rdbullet"/>
       </w:pPr>
       <w:r>
         <w:rPr>
-          <w:rFonts w:ascii="Arial" w:hAnsi="Arial"/>
           <w:b/>
-          <w:color w:val="000000"/>
-          <w:sz w:val="20"/>
         </w:rPr>
         <w:t>Transformation avec Data Build Tool, SQL, Python</w:t>
       </w:r>
@@ -495,180 +317,106 @@
     <w:p>
       <w:pPr>
         <w:pStyle w:val="DC2ndbullet"/>
-        <w:jc w:val="left"/>
+      </w:pPr>
+      <w:r>
+        <w:t>Support aux cas d’usage et analytiques</w:t>
+      </w:r>
+    </w:p>
+    <w:p>
+      <w:pPr>
+        <w:pStyle w:val="DC2ndbullet"/>
+      </w:pPr>
+      <w:r>
+        <w:t>Réalisation de tests unitaires, configuration dynamique, retraitement régulier</w:t>
+      </w:r>
+    </w:p>
+    <w:p>
+      <w:pPr>
+        <w:pStyle w:val="DC2ndbullet"/>
+      </w:pPr>
+      <w:r>
+        <w:t>Architecture médaillon Databricks</w:t>
+      </w:r>
+    </w:p>
+    <w:p>
+      <w:pPr>
+        <w:pStyle w:val="DC2ndbullet"/>
+      </w:pPr>
+      <w:r>
+        <w:t>Construction de plusieurs niveaux de traitement et assemblage de tables</w:t>
+      </w:r>
+    </w:p>
+    <w:p>
+      <w:pPr>
+        <w:pStyle w:val="DC2ndbullet"/>
+      </w:pPr>
+      <w:r>
+        <w:t>Développement de traitements dynamiques</w:t>
+      </w:r>
+    </w:p>
+    <w:p>
+      <w:pPr>
+        <w:pStyle w:val="DC2ndbullet"/>
+      </w:pPr>
+      <w:r>
+        <w:t>Unification des données dans un lakehouse optimisé</w:t>
+      </w:r>
+    </w:p>
+    <w:p>
+      <w:pPr>
+        <w:pStyle w:val="DC2ndbullet"/>
+      </w:pPr>
+      <w:r>
+        <w:t>Intégration d’une démarche CI/CD Databricks CLI pour les pipelines</w:t>
+      </w:r>
+    </w:p>
+    <w:p>
+      <w:pPr>
+        <w:pStyle w:val="DC2ndbullet"/>
+      </w:pPr>
+      <w:r>
+        <w:t>Mise en place de bonnes pratiques FinOps sur Databricks</w:t>
+      </w:r>
+    </w:p>
+    <w:p>
+      <w:pPr>
+        <w:pStyle w:val="DC1stbullet"/>
+      </w:pPr>
+      <w:r>
+        <w:t>Visualisation</w:t>
+      </w:r>
+    </w:p>
+    <w:p>
+      <w:pPr>
+        <w:pStyle w:val="DC2ndbullet"/>
+      </w:pPr>
+      <w:r>
+        <w:t>Développement de Dashboards PowerBI, Looker dynamiques</w:t>
+      </w:r>
+    </w:p>
+    <w:p>
+      <w:pPr>
+        <w:pStyle w:val="DC2ndbullet"/>
+      </w:pPr>
+      <w:r>
+        <w:t>Recherche et vulgarisation d’indicateurs clés de performance</w:t>
+      </w:r>
+    </w:p>
+    <w:p>
+      <w:pPr>
+        <w:pStyle w:val="DC2ndbullet"/>
+      </w:pPr>
+      <w:r>
+        <w:t>Implémentation d’une data gouvernance :</w:t>
+      </w:r>
+    </w:p>
+    <w:p>
+      <w:pPr>
+        <w:pStyle w:val="DC3rdbullet"/>
       </w:pPr>
       <w:r>
         <w:rPr>
-          <w:rFonts w:ascii="Arial" w:hAnsi="Arial"/>
-          <w:color w:val="000000"/>
-          <w:sz w:val="20"/>
-        </w:rPr>
-        <w:t>Support aux cas d’usage et analytiques</w:t>
-      </w:r>
-    </w:p>
-    <w:p>
-      <w:pPr>
-        <w:pStyle w:val="DC2ndbullet"/>
-        <w:jc w:val="left"/>
-      </w:pPr>
-      <w:r>
-        <w:rPr>
-          <w:rFonts w:ascii="Arial" w:hAnsi="Arial"/>
-          <w:color w:val="000000"/>
-          <w:sz w:val="20"/>
-        </w:rPr>
-        <w:t>Réalisation de tests unitaires, configuration dynamique, retraitement régulier</w:t>
-      </w:r>
-    </w:p>
-    <w:p>
-      <w:pPr>
-        <w:pStyle w:val="DC2ndbullet"/>
-        <w:jc w:val="left"/>
-      </w:pPr>
-      <w:r>
-        <w:rPr>
-          <w:rFonts w:ascii="Arial" w:hAnsi="Arial"/>
-          <w:color w:val="000000"/>
-          <w:sz w:val="20"/>
-        </w:rPr>
-        <w:t>Architecture médaillon Databricks</w:t>
-      </w:r>
-    </w:p>
-    <w:p>
-      <w:pPr>
-        <w:pStyle w:val="DC2ndbullet"/>
-        <w:jc w:val="left"/>
-      </w:pPr>
-      <w:r>
-        <w:rPr>
-          <w:rFonts w:ascii="Arial" w:hAnsi="Arial"/>
-          <w:color w:val="000000"/>
-          <w:sz w:val="20"/>
-        </w:rPr>
-        <w:t>Construction de plusieurs niveaux de traitement et assemblage de tables</w:t>
-      </w:r>
-    </w:p>
-    <w:p>
-      <w:pPr>
-        <w:pStyle w:val="DC2ndbullet"/>
-        <w:jc w:val="left"/>
-      </w:pPr>
-      <w:r>
-        <w:rPr>
-          <w:rFonts w:ascii="Arial" w:hAnsi="Arial"/>
-          <w:color w:val="000000"/>
-          <w:sz w:val="20"/>
-        </w:rPr>
-        <w:t>Développement de traitements dynamiques</w:t>
-      </w:r>
-    </w:p>
-    <w:p>
-      <w:pPr>
-        <w:pStyle w:val="DC2ndbullet"/>
-        <w:jc w:val="left"/>
-      </w:pPr>
-      <w:r>
-        <w:rPr>
-          <w:rFonts w:ascii="Arial" w:hAnsi="Arial"/>
-          <w:color w:val="000000"/>
-          <w:sz w:val="20"/>
-        </w:rPr>
-        <w:t>Unification des données dans un lakehouse optimisé</w:t>
-      </w:r>
-    </w:p>
-    <w:p>
-      <w:pPr>
-        <w:pStyle w:val="DC2ndbullet"/>
-        <w:jc w:val="left"/>
-      </w:pPr>
-      <w:r>
-        <w:rPr>
-          <w:rFonts w:ascii="Arial" w:hAnsi="Arial"/>
-          <w:color w:val="000000"/>
-          <w:sz w:val="20"/>
-        </w:rPr>
-        <w:t>Intégration d’une démarche CI/CD Databricks CLI pour les pipelines</w:t>
-      </w:r>
-    </w:p>
-    <w:p>
-      <w:pPr>
-        <w:pStyle w:val="DC2ndbullet"/>
-        <w:jc w:val="left"/>
-      </w:pPr>
-      <w:r>
-        <w:rPr>
-          <w:rFonts w:ascii="Arial" w:hAnsi="Arial"/>
-          <w:color w:val="000000"/>
-          <w:sz w:val="20"/>
-        </w:rPr>
-        <w:t>Mise en place de bonnes pratiques FinOps sur Databricks</w:t>
-      </w:r>
-    </w:p>
-    <w:p>
-      <w:pPr>
-        <w:pStyle w:val="DC1stbullet"/>
-        <w:jc w:val="left"/>
-      </w:pPr>
-      <w:r>
-        <w:rPr>
-          <w:color w:val="EC7C2F"/>
-        </w:rPr>
-        <w:t>Visualisation</w:t>
-      </w:r>
-    </w:p>
-    <w:p>
-      <w:pPr>
-        <w:pStyle w:val="DC2ndbullet"/>
-        <w:jc w:val="left"/>
-      </w:pPr>
-      <w:r>
-        <w:rPr>
-          <w:rFonts w:ascii="Arial" w:hAnsi="Arial"/>
-          <w:color w:val="000000"/>
-          <w:sz w:val="20"/>
-        </w:rPr>
-        <w:t>Développement de Dashboards PowerBI, Looker dynamiques</w:t>
-      </w:r>
-    </w:p>
-    <w:p>
-      <w:pPr>
-        <w:pStyle w:val="DC2ndbullet"/>
-        <w:jc w:val="left"/>
-      </w:pPr>
-      <w:r>
-        <w:rPr>
-          <w:rFonts w:ascii="Arial" w:hAnsi="Arial"/>
-          <w:color w:val="000000"/>
-          <w:sz w:val="20"/>
-        </w:rPr>
-        <w:t>Recherche et vulgarisation d’indicateurs clés de performance</w:t>
-      </w:r>
-    </w:p>
-    <w:p>
-      <w:pPr>
-        <w:pStyle w:val="DC2ndbullet"/>
-        <w:jc w:val="left"/>
-      </w:pPr>
-      <w:r>
-        <w:rPr>
-          <w:rFonts w:ascii="Arial" w:hAnsi="Arial"/>
-          <w:color w:val="000000"/>
-          <w:sz w:val="20"/>
-        </w:rPr>
-        <w:t>Implémentation d’une data gouvernance :</w:t>
-      </w:r>
-    </w:p>
-    <w:p>
-      <w:pPr>
-        <w:pStyle w:val="DC3rdbullet"/>
-        <w:jc w:val="left"/>
-      </w:pPr>
-      <w:r>
-        <w:rPr>
-          <w:rFonts w:ascii="Arial" w:hAnsi="Arial"/>
           <w:b/>
-          <w:color w:val="000000"/>
-          <w:sz w:val="20"/>
         </w:rPr>
         <w:t>Etude des compétences et besoins métiers</w:t>
       </w:r>
@@ -676,14 +424,10 @@
     <w:p>
       <w:pPr>
         <w:pStyle w:val="DC3rdbullet"/>
-        <w:jc w:val="left"/>
       </w:pPr>
       <w:r>
         <w:rPr>
-          <w:rFonts w:ascii="Arial" w:hAnsi="Arial"/>
           <w:b/>
-          <w:color w:val="000000"/>
-          <w:sz w:val="20"/>
         </w:rPr>
         <w:t>Conception des outils et indicateurs à mettre à disposition</w:t>
       </w:r>
@@ -691,14 +435,10 @@
     <w:p>
       <w:pPr>
         <w:pStyle w:val="DC3rdbullet"/>
-        <w:jc w:val="left"/>
       </w:pPr>
       <w:r>
         <w:rPr>
-          <w:rFonts w:ascii="Arial" w:hAnsi="Arial"/>
           <w:b/>
-          <w:color w:val="000000"/>
-          <w:sz w:val="20"/>
         </w:rPr>
         <w:t>Correction et optimisation des pipelines de données</w:t>
       </w:r>
@@ -706,29 +446,21 @@
     <w:p>
       <w:pPr>
         <w:pStyle w:val="DC3rdbullet"/>
-        <w:jc w:val="left"/>
       </w:pPr>
       <w:r>
         <w:rPr>
-          <w:rFonts w:ascii="Arial" w:hAnsi="Arial"/>
           <w:b/>
-          <w:color w:val="000000"/>
-          <w:sz w:val="20"/>
         </w:rPr>
         <w:t>Coordination entre les services</w:t>
       </w:r>
     </w:p>
     <w:p>
       <w:pPr>
-        <w:pStyle w:val="DCT1Sections"/>
-        <w:jc w:val="left"/>
+        <w:pStyle w:val="DC3rdbullet"/>
       </w:pPr>
       <w:r>
         <w:rPr>
-          <w:rFonts w:ascii="Arial" w:hAnsi="Arial"/>
           <w:b/>
-          <w:color w:val="000000"/>
-          <w:sz w:val="20"/>
         </w:rPr>
         <w:t>Ecriture des process et formation des équipes</w:t>
       </w:r>
@@ -736,206 +468,123 @@
     <w:p>
       <w:pPr>
         <w:pStyle w:val="DC2ndbullet"/>
-        <w:jc w:val="left"/>
-      </w:pPr>
-      <w:r>
-        <w:rPr>
-          <w:rFonts w:ascii="Arial" w:hAnsi="Arial"/>
-          <w:color w:val="000000"/>
-          <w:sz w:val="20"/>
-        </w:rPr>
+      </w:pPr>
+      <w:r>
         <w:t>Support aux cas d’usage et analytiques</w:t>
       </w:r>
     </w:p>
     <w:p>
       <w:pPr>
         <w:pStyle w:val="DC2ndbullet"/>
-        <w:jc w:val="left"/>
-      </w:pPr>
-      <w:r>
-        <w:rPr>
-          <w:rFonts w:ascii="Arial" w:hAnsi="Arial"/>
-          <w:color w:val="000000"/>
-          <w:sz w:val="20"/>
-        </w:rPr>
+      </w:pPr>
+      <w:r>
         <w:t>Conception de modèles ML et prévisionnels</w:t>
       </w:r>
     </w:p>
     <w:p>
       <w:pPr>
         <w:pStyle w:val="DC2ndbullet"/>
-        <w:jc w:val="left"/>
-      </w:pPr>
-      <w:r>
-        <w:rPr>
-          <w:rFonts w:ascii="Arial" w:hAnsi="Arial"/>
-          <w:color w:val="000000"/>
-          <w:sz w:val="20"/>
-        </w:rPr>
+      </w:pPr>
+      <w:r>
         <w:t>Référent des données disponibles</w:t>
       </w:r>
     </w:p>
     <w:p>
       <w:pPr>
         <w:pStyle w:val="DC2ndbullet"/>
-        <w:jc w:val="left"/>
-      </w:pPr>
-      <w:r>
-        <w:rPr>
-          <w:rFonts w:ascii="Arial" w:hAnsi="Arial"/>
-          <w:color w:val="000000"/>
-          <w:sz w:val="20"/>
-        </w:rPr>
+      </w:pPr>
+      <w:r>
         <w:t>Construction des requêtes SQL ponctuelles et planifiées</w:t>
       </w:r>
     </w:p>
     <w:p>
       <w:pPr>
         <w:pStyle w:val="DC2ndbullet"/>
-        <w:jc w:val="left"/>
-      </w:pPr>
-      <w:r>
-        <w:rPr>
-          <w:rFonts w:ascii="Arial" w:hAnsi="Arial"/>
-          <w:color w:val="000000"/>
-          <w:sz w:val="20"/>
-        </w:rPr>
+      </w:pPr>
+      <w:r>
         <w:t>Intégration et développement de reverse engineering</w:t>
       </w:r>
     </w:p>
     <w:p>
       <w:pPr>
         <w:pStyle w:val="DC1stbullet"/>
-        <w:jc w:val="left"/>
-      </w:pPr>
-      <w:r>
-        <w:rPr>
-          <w:color w:val="EC7C2F"/>
-        </w:rPr>
+      </w:pPr>
+      <w:r>
         <w:t>Applicatif</w:t>
       </w:r>
     </w:p>
     <w:p>
       <w:pPr>
         <w:pStyle w:val="DC2ndbullet"/>
-        <w:jc w:val="left"/>
-      </w:pPr>
-      <w:r>
-        <w:rPr>
-          <w:rFonts w:ascii="Arial" w:hAnsi="Arial"/>
-          <w:color w:val="000000"/>
-          <w:sz w:val="20"/>
-        </w:rPr>
+      </w:pPr>
+      <w:r>
         <w:t>Etude de besoin utilisateur</w:t>
       </w:r>
     </w:p>
     <w:p>
       <w:pPr>
         <w:pStyle w:val="DC2ndbullet"/>
-        <w:jc w:val="left"/>
-      </w:pPr>
-      <w:r>
-        <w:rPr>
-          <w:rFonts w:ascii="Arial" w:hAnsi="Arial"/>
-          <w:color w:val="000000"/>
-          <w:sz w:val="20"/>
-        </w:rPr>
+      </w:pPr>
+      <w:r>
         <w:t>Développement d’application pour la délivrabilité et la visualisation de données avec le Framework Streamlit</w:t>
       </w:r>
     </w:p>
     <w:p>
       <w:pPr>
         <w:pStyle w:val="DC2ndbullet"/>
-        <w:jc w:val="left"/>
-      </w:pPr>
-      <w:r>
-        <w:rPr>
-          <w:rFonts w:ascii="Arial" w:hAnsi="Arial"/>
-          <w:color w:val="000000"/>
-          <w:sz w:val="20"/>
-        </w:rPr>
+      </w:pPr>
+      <w:r>
         <w:t>Interactions et échanges de données avec des serveurs et bases de données (Backend)</w:t>
       </w:r>
     </w:p>
     <w:p>
       <w:pPr>
         <w:pStyle w:val="DC2ndbullet"/>
-        <w:jc w:val="left"/>
-      </w:pPr>
-      <w:r>
-        <w:rPr>
-          <w:rFonts w:ascii="Arial" w:hAnsi="Arial"/>
-          <w:color w:val="000000"/>
-          <w:sz w:val="20"/>
-        </w:rPr>
+      </w:pPr>
+      <w:r>
         <w:t>Interface dynamique et construction de documents de publipostage (Frontend)</w:t>
       </w:r>
     </w:p>
     <w:p>
       <w:pPr>
         <w:pStyle w:val="DC2ndbullet"/>
-        <w:jc w:val="left"/>
-      </w:pPr>
-      <w:r>
-        <w:rPr>
-          <w:rFonts w:ascii="Arial" w:hAnsi="Arial"/>
-          <w:color w:val="000000"/>
-          <w:sz w:val="20"/>
-        </w:rPr>
+      </w:pPr>
+      <w:r>
         <w:t>Démarche UX/UI et optimisation intuitive des actions utilisateurs</w:t>
       </w:r>
     </w:p>
     <w:p>
       <w:pPr>
         <w:pStyle w:val="DC1stbullet"/>
-        <w:jc w:val="left"/>
-      </w:pPr>
-      <w:r>
-        <w:rPr>
-          <w:color w:val="EC7C2F"/>
-        </w:rPr>
+      </w:pPr>
+      <w:r>
         <w:t>Technologies</w:t>
       </w:r>
     </w:p>
     <w:p>
       <w:pPr>
         <w:pStyle w:val="DC2ndbullet"/>
-        <w:jc w:val="left"/>
-      </w:pPr>
-      <w:r>
-        <w:rPr>
-          <w:rFonts w:ascii="Arial" w:hAnsi="Arial"/>
-          <w:color w:val="000000"/>
-          <w:sz w:val="20"/>
-        </w:rPr>
+      </w:pPr>
+      <w:r>
         <w:t>Python, Pandas, SQL, PostgreSQL, PgAdmin, Databricks, Docker, DevContainers, DBT, Docxtpl, Jinja, DuckDB, MotherDuck, Power BI, Looker</w:t>
       </w:r>
     </w:p>
     <w:p>
       <w:pPr>
-        <w:jc w:val="left"/>
-      </w:pPr>
-    </w:p>
-    <w:p>
-      <w:pPr>
-        <w:jc w:val="left"/>
+        <w:pStyle w:val="DCNormal"/>
       </w:pPr>
     </w:p>
     <w:p>
       <w:pPr>
         <w:pStyle w:val="DCT1Sections"/>
-        <w:jc w:val="left"/>
-      </w:pPr>
-      <w:r>
-        <w:rPr>
-          <w:color w:val="538CD4"/>
-        </w:rPr>
+      </w:pPr>
+      <w:r>
         <w:t>Formation</w:t>
       </w:r>
     </w:p>
     <w:p>
       <w:pPr>
-        <w:jc w:val="left"/>
+        <w:pStyle w:val="DCNormal"/>
       </w:pPr>
     </w:p>
     <w:tbl>
@@ -943,17 +592,33 @@
         <w:tblStyle w:val="Grilledutableau"/>
         <w:tblW w:type="auto" w:w="0"/>
         <w:tblLook w:firstColumn="1" w:firstRow="1" w:lastColumn="0" w:lastRow="0" w:noHBand="0" w:noVBand="1" w:val="04A0"/>
+        <w:tblBorders>
+          <w:top w:val="single" w:sz="10" w:space="0" w:color="000000"/>
+          <w:left w:val="single" w:sz="10" w:space="0" w:color="000000"/>
+          <w:bottom w:val="single" w:sz="10" w:space="0" w:color="000000"/>
+          <w:right w:val="single" w:sz="10" w:space="0" w:color="000000"/>
+          <w:insideH w:val="single" w:sz="10" w:space="0" w:color="000000"/>
+          <w:insideV w:val="single" w:sz="10" w:space="0" w:color="000000"/>
+        </w:tblBorders>
       </w:tblPr>
       <w:tblGrid>
-        <w:gridCol w:w="4986"/>
-        <w:gridCol w:w="4986"/>
+        <w:gridCol w:w="4819"/>
+        <w:gridCol w:w="4819"/>
       </w:tblGrid>
       <w:tr>
+        <w:trPr>
+          <w:trHeight w:val="360"/>
+        </w:trPr>
         <w:tc>
           <w:tcPr>
-            <w:tcW w:type="dxa" w:w="4986"/>
+            <w:tcW w:type="dxa" w:w="2835"/>
+            <w:vAlign w:val="center"/>
           </w:tcPr>
           <w:p>
+            <w:pPr>
+              <w:pStyle w:val="DCTableYear"/>
+              <w:jc w:val="left"/>
+            </w:pPr>
             <w:r>
               <w:rPr>
                 <w:b/>
@@ -964,27 +629,43 @@
         </w:tc>
         <w:tc>
           <w:tcPr>
-            <w:tcW w:type="dxa" w:w="4986"/>
+            <w:tcW w:type="dxa" w:w="6803"/>
+            <w:vAlign w:val="center"/>
           </w:tcPr>
           <w:p>
+            <w:pPr>
+              <w:pStyle w:val="DCTableContent"/>
+              <w:jc w:val="left"/>
+            </w:pPr>
             <w:r>
               <w:t>Formation Concepteur Développeur en IA et analyse Big Data - Option Data analyse</w:t>
             </w:r>
           </w:p>
           <w:p>
+            <w:pPr>
+              <w:pStyle w:val="DCTableContent"/>
+              <w:jc w:val="left"/>
+            </w:pPr>
             <w:r>
               <w:t>Le Wagon Bordeaux</w:t>
             </w:r>
           </w:p>
-          <w:p/>
         </w:tc>
       </w:tr>
       <w:tr>
+        <w:trPr>
+          <w:trHeight w:val="360"/>
+        </w:trPr>
         <w:tc>
           <w:tcPr>
-            <w:tcW w:type="dxa" w:w="4986"/>
+            <w:tcW w:type="dxa" w:w="2835"/>
+            <w:vAlign w:val="center"/>
           </w:tcPr>
           <w:p>
+            <w:pPr>
+              <w:pStyle w:val="DCTableYear"/>
+              <w:jc w:val="left"/>
+            </w:pPr>
             <w:r>
               <w:rPr>
                 <w:b/>
@@ -995,27 +676,43 @@
         </w:tc>
         <w:tc>
           <w:tcPr>
-            <w:tcW w:type="dxa" w:w="4986"/>
+            <w:tcW w:type="dxa" w:w="6803"/>
+            <w:vAlign w:val="center"/>
           </w:tcPr>
           <w:p>
+            <w:pPr>
+              <w:pStyle w:val="DCTableContent"/>
+              <w:jc w:val="left"/>
+            </w:pPr>
             <w:r>
               <w:t>Master Manager en stratégie digitale et MBA Web Business</w:t>
             </w:r>
           </w:p>
           <w:p>
+            <w:pPr>
+              <w:pStyle w:val="DCTableContent"/>
+              <w:jc w:val="left"/>
+            </w:pPr>
             <w:r>
               <w:t>ESCEN Bordeaux</w:t>
             </w:r>
           </w:p>
-          <w:p/>
         </w:tc>
       </w:tr>
       <w:tr>
+        <w:trPr>
+          <w:trHeight w:val="360"/>
+        </w:trPr>
         <w:tc>
           <w:tcPr>
-            <w:tcW w:type="dxa" w:w="4986"/>
+            <w:tcW w:type="dxa" w:w="2835"/>
+            <w:vAlign w:val="center"/>
           </w:tcPr>
           <w:p>
+            <w:pPr>
+              <w:pStyle w:val="DCTableYear"/>
+              <w:jc w:val="left"/>
+            </w:pPr>
             <w:r>
               <w:rPr>
                 <w:b/>
@@ -1026,27 +723,43 @@
         </w:tc>
         <w:tc>
           <w:tcPr>
-            <w:tcW w:type="dxa" w:w="4986"/>
+            <w:tcW w:type="dxa" w:w="6803"/>
+            <w:vAlign w:val="center"/>
           </w:tcPr>
           <w:p>
+            <w:pPr>
+              <w:pStyle w:val="DCTableContent"/>
+              <w:jc w:val="left"/>
+            </w:pPr>
             <w:r>
               <w:t>Bachelor Webmarketing et sites e-commerce</w:t>
             </w:r>
           </w:p>
           <w:p>
+            <w:pPr>
+              <w:pStyle w:val="DCTableContent"/>
+              <w:jc w:val="left"/>
+            </w:pPr>
             <w:r>
               <w:t>ESCEN Bordeaux</w:t>
             </w:r>
           </w:p>
-          <w:p/>
         </w:tc>
       </w:tr>
       <w:tr>
+        <w:trPr>
+          <w:trHeight w:val="360"/>
+        </w:trPr>
         <w:tc>
           <w:tcPr>
-            <w:tcW w:type="dxa" w:w="4986"/>
+            <w:tcW w:type="dxa" w:w="2835"/>
+            <w:vAlign w:val="center"/>
           </w:tcPr>
           <w:p>
+            <w:pPr>
+              <w:pStyle w:val="DCTableYear"/>
+              <w:jc w:val="left"/>
+            </w:pPr>
             <w:r>
               <w:rPr>
                 <w:b/>
@@ -1057,73 +770,46 @@
         </w:tc>
         <w:tc>
           <w:tcPr>
-            <w:tcW w:type="dxa" w:w="4986"/>
+            <w:tcW w:type="dxa" w:w="6803"/>
+            <w:vAlign w:val="center"/>
           </w:tcPr>
           <w:p>
+            <w:pPr>
+              <w:pStyle w:val="DCTableContent"/>
+              <w:jc w:val="left"/>
+            </w:pPr>
             <w:r>
               <w:t>DUT GEA spécialité gestion financière et comptable</w:t>
             </w:r>
           </w:p>
           <w:p>
+            <w:pPr>
+              <w:pStyle w:val="DCTableContent"/>
+              <w:jc w:val="left"/>
+            </w:pPr>
             <w:r>
               <w:t>IUT Bordeaux Montesquieu</w:t>
             </w:r>
           </w:p>
-          <w:p/>
         </w:tc>
       </w:tr>
     </w:tbl>
     <w:p>
       <w:pPr>
-        <w:jc w:val="left"/>
-      </w:pPr>
-    </w:p>
-    <w:p>
-      <w:pPr>
-        <w:jc w:val="left"/>
-        <w:sectPr>
-          <w:type w:val="nextPage"/>
-          <w:pgSz w:w="11920" w:h="16840" w:orient="portrait"/>
-          <w:pgMar w:top="1440" w:right="1440" w:bottom="1440" w:left="1440" w:header="720" w:footer="720"/>
-        </w:sectPr>
-      </w:pPr>
-      <w:r>
-        <w:rPr>
-          <w:color w:val="538CD4"/>
-        </w:rPr>
-        <w:t>Anglais :</w:t>
-      </w:r>
-      <w:r>
-        <w:rPr>
-          <w:color w:val="000000"/>
-          <w:sz w:val="22"/>
-        </w:rPr>
-        <w:t xml:space="preserve"> Lu, écrit, parlé, professionnel</w:t>
-      </w:r>
+        <w:pStyle w:val="DCNormal"/>
+      </w:pPr>
     </w:p>
     <w:p>
       <w:pPr>
         <w:pStyle w:val="DCT1Sections"/>
-        <w:jc w:val="left"/>
-      </w:pPr>
-      <w:r>
-        <w:rPr>
-          <w:rFonts w:ascii="Arial" w:hAnsi="Arial"/>
-          <w:b/>
-          <w:color w:val="538CD4"/>
-          <w:sz w:val="32"/>
-        </w:rPr>
-        <w:t>Expériences Professionnelles</w:t>
-      </w:r>
-    </w:p>
-    <w:p>
-      <w:pPr>
-        <w:jc w:val="left"/>
-      </w:pPr>
-    </w:p>
-    <w:p>
-      <w:pPr>
-        <w:jc w:val="left"/>
+      </w:pPr>
+      <w:r>
+        <w:t>Langues</w:t>
+      </w:r>
+    </w:p>
+    <w:p>
+      <w:pPr>
+        <w:pStyle w:val="DCNormal"/>
       </w:pPr>
     </w:p>
     <w:tbl>
@@ -1131,17 +817,108 @@
         <w:tblStyle w:val="Grilledutableau"/>
         <w:tblW w:type="auto" w:w="0"/>
         <w:tblLook w:firstColumn="1" w:firstRow="1" w:lastColumn="0" w:lastRow="0" w:noHBand="0" w:noVBand="1" w:val="04A0"/>
+        <w:tblBorders>
+          <w:top w:val="single" w:sz="10" w:space="0" w:color="000000"/>
+          <w:left w:val="single" w:sz="10" w:space="0" w:color="000000"/>
+          <w:bottom w:val="single" w:sz="10" w:space="0" w:color="000000"/>
+          <w:right w:val="single" w:sz="10" w:space="0" w:color="000000"/>
+          <w:insideH w:val="single" w:sz="10" w:space="0" w:color="000000"/>
+          <w:insideV w:val="single" w:sz="10" w:space="0" w:color="000000"/>
+        </w:tblBorders>
       </w:tblPr>
       <w:tblGrid>
-        <w:gridCol w:w="4986"/>
-        <w:gridCol w:w="4986"/>
+        <w:gridCol w:w="4819"/>
+        <w:gridCol w:w="4819"/>
       </w:tblGrid>
       <w:tr>
+        <w:trPr>
+          <w:trHeight w:val="360"/>
+        </w:trPr>
         <w:tc>
           <w:tcPr>
-            <w:tcW w:type="dxa" w:w="4986"/>
+            <w:tcW w:type="dxa" w:w="2835"/>
+            <w:vAlign w:val="center"/>
           </w:tcPr>
           <w:p>
+            <w:pPr>
+              <w:pStyle w:val="DCTableYear"/>
+              <w:jc w:val="left"/>
+            </w:pPr>
+            <w:r>
+              <w:t>Anglais</w:t>
+            </w:r>
+          </w:p>
+        </w:tc>
+        <w:tc>
+          <w:tcPr>
+            <w:tcW w:type="dxa" w:w="6803"/>
+            <w:vAlign w:val="center"/>
+          </w:tcPr>
+          <w:p>
+            <w:pPr>
+              <w:pStyle w:val="DCTableContent"/>
+              <w:jc w:val="left"/>
+            </w:pPr>
+            <w:r>
+              <w:t xml:space="preserve"> Lu, écrit, parlé, professionnel</w:t>
+            </w:r>
+          </w:p>
+        </w:tc>
+      </w:tr>
+    </w:tbl>
+    <w:p>
+      <w:pPr>
+        <w:pStyle w:val="DCNormal"/>
+      </w:pPr>
+    </w:p>
+    <w:p>
+      <w:pPr>
+        <w:pStyle w:val="DCT1Sections"/>
+      </w:pPr>
+      <w:r>
+        <w:rPr>
+          <w:b/>
+        </w:rPr>
+        <w:t>Expériences Professionnelles</w:t>
+      </w:r>
+    </w:p>
+    <w:p>
+      <w:pPr>
+        <w:pStyle w:val="DCNormal"/>
+      </w:pPr>
+    </w:p>
+    <w:tbl>
+      <w:tblPr>
+        <w:tblStyle w:val="Grilledutableau"/>
+        <w:tblW w:type="auto" w:w="0"/>
+        <w:tblLook w:firstColumn="1" w:firstRow="1" w:lastColumn="0" w:lastRow="0" w:noHBand="0" w:noVBand="1" w:val="04A0"/>
+        <w:tblBorders>
+          <w:top w:val="none" w:sz="0" w:space="0" w:color="auto"/>
+          <w:left w:val="none" w:sz="0" w:space="0" w:color="auto"/>
+          <w:bottom w:val="single" w:sz="10" w:space="0" w:color="000000"/>
+          <w:right w:val="none" w:sz="0" w:space="0" w:color="auto"/>
+          <w:insideH w:val="none" w:sz="0" w:space="0" w:color="auto"/>
+          <w:insideV w:val="none" w:sz="0" w:space="0" w:color="auto"/>
+        </w:tblBorders>
+      </w:tblPr>
+      <w:tblGrid>
+        <w:gridCol w:w="4819"/>
+        <w:gridCol w:w="4819"/>
+      </w:tblGrid>
+      <w:tr>
+        <w:trPr>
+          <w:trHeight w:val="360"/>
+        </w:trPr>
+        <w:tc>
+          <w:tcPr>
+            <w:tcW w:type="dxa" w:w="6803"/>
+            <w:vAlign w:val="center"/>
+          </w:tcPr>
+          <w:p>
+            <w:pPr>
+              <w:pStyle w:val="DCXPTitle"/>
+              <w:jc w:val="left"/>
+            </w:pPr>
             <w:r>
               <w:t>Automotive Cells Company</w:t>
             </w:r>
@@ -1149,9 +926,14 @@
         </w:tc>
         <w:tc>
           <w:tcPr>
-            <w:tcW w:type="dxa" w:w="4986"/>
+            <w:tcW w:type="dxa" w:w="2835"/>
+            <w:vAlign w:val="center"/>
           </w:tcPr>
           <w:p>
+            <w:pPr>
+              <w:pStyle w:val="DCXPDate"/>
+              <w:jc w:val="right"/>
+            </w:pPr>
             <w:r>
               <w:rPr>
                 <w:b/>
@@ -1163,11 +945,19 @@
         </w:tc>
       </w:tr>
       <w:tr>
+        <w:trPr>
+          <w:trHeight w:val="360"/>
+        </w:trPr>
         <w:tc>
           <w:tcPr>
-            <w:tcW w:type="dxa" w:w="4986"/>
+            <w:tcW w:type="dxa" w:w="6803"/>
+            <w:vAlign w:val="center"/>
           </w:tcPr>
           <w:p>
+            <w:pPr>
+              <w:pStyle w:val="DCXPPoste"/>
+              <w:jc w:val="left"/>
+            </w:pPr>
             <w:r>
               <w:rPr>
                 <w:b/>
@@ -1178,7 +968,8 @@
         </w:tc>
         <w:tc>
           <w:tcPr>
-            <w:tcW w:type="dxa" w:w="4986"/>
+            <w:tcW w:type="dxa" w:w="2835"/>
+            <w:vAlign w:val="center"/>
           </w:tcPr>
           <w:p/>
         </w:tc>
@@ -1186,199 +977,126 @@
     </w:tbl>
     <w:p>
       <w:pPr>
-        <w:jc w:val="left"/>
+        <w:pStyle w:val="DCNormal"/>
+      </w:pPr>
+    </w:p>
+    <w:p>
+      <w:pPr>
+        <w:pStyle w:val="DCNormal"/>
       </w:pPr>
       <w:r>
         <w:rPr>
-          <w:rFonts w:ascii="Arial" w:hAnsi="Arial"/>
           <w:b/>
-          <w:color w:val="000000"/>
-          <w:sz w:val="20"/>
         </w:rPr>
         <w:t xml:space="preserve">Contexte : </w:t>
       </w:r>
       <w:r>
+        <w:t>Ma première mission au sein d’EPSYL-ALCEN s’est déroulée dans le centre d’études et d’innovation d’ACC à Bruges. Dans le cadre de mises en place de process data automatisés, j’ai rejoint l’équipe data R&amp;D qui développe des pipelines et des applications de traitement de données pour la délivrer de manière dynamique et robuste aux autres services d’ingénierie.</w:t>
+      </w:r>
+    </w:p>
+    <w:p>
+      <w:pPr>
+        <w:pStyle w:val="DC1stbullet"/>
+      </w:pPr>
+      <w:r>
+        <w:t>Gestion de projets</w:t>
+      </w:r>
+    </w:p>
+    <w:p>
+      <w:pPr>
+        <w:pStyle w:val="DC2ndbullet"/>
+      </w:pPr>
+      <w:r>
+        <w:t>Recueil des besoins, des contraintes et spécifications</w:t>
+      </w:r>
+    </w:p>
+    <w:p>
+      <w:pPr>
+        <w:pStyle w:val="DC2ndbullet"/>
+      </w:pPr>
+      <w:r>
+        <w:t xml:space="preserve">Etude de faisabilité et proposition de solutions techniques </w:t>
+      </w:r>
+    </w:p>
+    <w:p>
+      <w:pPr>
+        <w:pStyle w:val="DC2ndbullet"/>
+      </w:pPr>
+      <w:r>
+        <w:t>Communication avec les équipes, organisation des points d’avancement</w:t>
+      </w:r>
+    </w:p>
+    <w:p>
+      <w:pPr>
+        <w:pStyle w:val="DC2ndbullet"/>
+      </w:pPr>
+      <w:r>
+        <w:t>Rédaction de préconisations métiers, écriture des process, Formation des équipes</w:t>
+      </w:r>
+    </w:p>
+    <w:p>
+      <w:pPr>
+        <w:pStyle w:val="DC2ndbullet"/>
+      </w:pPr>
+      <w:r>
+        <w:t>Reportings</w:t>
+      </w:r>
+    </w:p>
+    <w:p>
+      <w:pPr>
+        <w:pStyle w:val="DC1stbullet"/>
+      </w:pPr>
+      <w:r>
+        <w:t>Collecte des données</w:t>
+      </w:r>
+    </w:p>
+    <w:p>
+      <w:pPr>
+        <w:pStyle w:val="DC2ndbullet"/>
+      </w:pPr>
+      <w:r>
+        <w:t xml:space="preserve">Etudes des sources de données, Construction et amélioration de l’architecture </w:t>
+      </w:r>
+    </w:p>
+    <w:p>
+      <w:pPr>
+        <w:pStyle w:val="DC2ndbullet"/>
+      </w:pPr>
+      <w:r>
+        <w:t>Requêtes SQL sur les bases de données PostgreSQL</w:t>
+      </w:r>
+    </w:p>
+    <w:p>
+      <w:pPr>
+        <w:pStyle w:val="DC2ndbullet"/>
+      </w:pPr>
+      <w:r>
+        <w:t>Traitements de données en Python Pandas</w:t>
+      </w:r>
+    </w:p>
+    <w:p>
+      <w:pPr>
+        <w:pStyle w:val="DC2ndbullet"/>
+      </w:pPr>
+      <w:r>
+        <w:t>Construction d’un formulaire dynamique de complétion des données par l’utilisateur</w:t>
+      </w:r>
+    </w:p>
+    <w:p>
+      <w:pPr>
+        <w:pStyle w:val="DC1stbullet"/>
+      </w:pPr>
+      <w:r>
+        <w:t>Traitement des bases de données</w:t>
+      </w:r>
+    </w:p>
+    <w:p>
+      <w:pPr>
+        <w:pStyle w:val="DC2ndbullet"/>
+      </w:pPr>
+      <w:r>
         <w:rPr>
-          <w:rFonts w:ascii="Arial" w:hAnsi="Arial"/>
-          <w:color w:val="000000"/>
-          <w:sz w:val="20"/>
-        </w:rPr>
-        <w:t>Ma première mission au sein d’EPSYL-ALCEN s’est déroulée dans le centre d’études et d’innovation d’ACC à Bruges. Dans le cadre de mises en place de process data automatisés, j’ai rejoint l’équipe data R&amp;D qui développe des pipelines et des applications de traitement de données pour la délivrer de manière dynamique et robuste aux autres services d’ingénierie.</w:t>
-      </w:r>
-    </w:p>
-    <w:p>
-      <w:pPr>
-        <w:pStyle w:val="DC1stbullet"/>
-        <w:jc w:val="left"/>
-      </w:pPr>
-      <w:r>
-        <w:rPr>
-          <w:color w:val="EC7C2F"/>
-        </w:rPr>
-        <w:t>Gestion de projets</w:t>
-      </w:r>
-    </w:p>
-    <w:p>
-      <w:pPr>
-        <w:pStyle w:val="DC2ndbullet"/>
-        <w:jc w:val="left"/>
-      </w:pPr>
-      <w:r>
-        <w:rPr>
-          <w:rFonts w:ascii="Arial" w:hAnsi="Arial"/>
-          <w:color w:val="000000"/>
-          <w:sz w:val="20"/>
-        </w:rPr>
-        <w:t>Recueil des besoins, des contraintes et spécifications</w:t>
-      </w:r>
-    </w:p>
-    <w:p>
-      <w:pPr>
-        <w:pStyle w:val="DC2ndbullet"/>
-        <w:jc w:val="left"/>
-      </w:pPr>
-      <w:r>
-        <w:rPr>
-          <w:rFonts w:ascii="Arial" w:hAnsi="Arial"/>
-          <w:color w:val="000000"/>
-          <w:sz w:val="20"/>
-        </w:rPr>
-        <w:t xml:space="preserve">Etude de faisabilité et proposition de solutions techniques </w:t>
-      </w:r>
-    </w:p>
-    <w:p>
-      <w:pPr>
-        <w:pStyle w:val="DC2ndbullet"/>
-        <w:jc w:val="left"/>
-      </w:pPr>
-      <w:r>
-        <w:rPr>
-          <w:rFonts w:ascii="Arial" w:hAnsi="Arial"/>
-          <w:color w:val="000000"/>
-          <w:sz w:val="20"/>
-        </w:rPr>
-        <w:t>Communication avec les équipes, organisation des points d’avancement</w:t>
-      </w:r>
-    </w:p>
-    <w:p>
-      <w:pPr>
-        <w:pStyle w:val="DC2ndbullet"/>
-        <w:jc w:val="left"/>
-      </w:pPr>
-      <w:r>
-        <w:rPr>
-          <w:rFonts w:ascii="Arial" w:hAnsi="Arial"/>
-          <w:color w:val="000000"/>
-          <w:sz w:val="20"/>
-        </w:rPr>
-        <w:t>Rédaction de préconisations métiers, écriture des process, Formation des équipes</w:t>
-      </w:r>
-    </w:p>
-    <w:p>
-      <w:pPr>
-        <w:pStyle w:val="DC2ndbullet"/>
-        <w:jc w:val="left"/>
-      </w:pPr>
-      <w:r>
-        <w:rPr>
-          <w:rFonts w:ascii="Arial" w:hAnsi="Arial"/>
-          <w:color w:val="000000"/>
-          <w:sz w:val="20"/>
-        </w:rPr>
-        <w:t>Reportings</w:t>
-      </w:r>
-    </w:p>
-    <w:p>
-      <w:pPr>
-        <w:pStyle w:val="DC1stbullet"/>
-        <w:jc w:val="left"/>
-      </w:pPr>
-      <w:r>
-        <w:rPr>
-          <w:color w:val="EC7C2F"/>
-        </w:rPr>
-        <w:t>Collecte des données</w:t>
-      </w:r>
-    </w:p>
-    <w:p>
-      <w:pPr>
-        <w:pStyle w:val="DC2ndbullet"/>
-        <w:jc w:val="left"/>
-      </w:pPr>
-      <w:r>
-        <w:rPr>
-          <w:rFonts w:ascii="Arial" w:hAnsi="Arial"/>
-          <w:color w:val="000000"/>
-          <w:sz w:val="20"/>
-        </w:rPr>
-        <w:t xml:space="preserve">Etudes des sources de données, Construction et amélioration de l’architecture </w:t>
-      </w:r>
-    </w:p>
-    <w:p>
-      <w:pPr>
-        <w:pStyle w:val="DC2ndbullet"/>
-        <w:jc w:val="left"/>
-      </w:pPr>
-      <w:r>
-        <w:rPr>
-          <w:rFonts w:ascii="Arial" w:hAnsi="Arial"/>
-          <w:color w:val="000000"/>
-          <w:sz w:val="20"/>
-        </w:rPr>
-        <w:t>Requêtes SQL sur les bases de données PostgreSQL</w:t>
-      </w:r>
-    </w:p>
-    <w:p>
-      <w:pPr>
-        <w:pStyle w:val="DC2ndbullet"/>
-        <w:jc w:val="left"/>
-      </w:pPr>
-      <w:r>
-        <w:rPr>
-          <w:rFonts w:ascii="Arial" w:hAnsi="Arial"/>
-          <w:color w:val="000000"/>
-          <w:sz w:val="20"/>
-        </w:rPr>
-        <w:t>Traitements de données en Python Pandas</w:t>
-      </w:r>
-    </w:p>
-    <w:p>
-      <w:pPr>
-        <w:pStyle w:val="DC2ndbullet"/>
-        <w:jc w:val="left"/>
-      </w:pPr>
-      <w:r>
-        <w:rPr>
-          <w:rFonts w:ascii="Arial" w:hAnsi="Arial"/>
-          <w:color w:val="000000"/>
-          <w:sz w:val="20"/>
-        </w:rPr>
-        <w:t>Construction d’un formulaire dynamique de complétion des données par l’utilisateur</w:t>
-      </w:r>
-    </w:p>
-    <w:p>
-      <w:pPr>
-        <w:pStyle w:val="DC1stbullet"/>
-        <w:jc w:val="left"/>
-      </w:pPr>
-      <w:r>
-        <w:rPr>
-          <w:color w:val="EC7C2F"/>
-        </w:rPr>
-        <w:t>Traitement des bases de données</w:t>
-      </w:r>
-    </w:p>
-    <w:p>
-      <w:pPr>
-        <w:pStyle w:val="DC2ndbullet"/>
-        <w:jc w:val="left"/>
-      </w:pPr>
-      <w:r>
-        <w:rPr>
-          <w:rFonts w:ascii="Arial" w:hAnsi="Arial"/>
           <w:b/>
-          <w:color w:val="000000"/>
-          <w:sz w:val="20"/>
         </w:rPr>
         <w:t>Traitements des données :</w:t>
       </w:r>
@@ -1386,14 +1104,10 @@
     <w:p>
       <w:pPr>
         <w:pStyle w:val="DC4thbullet"/>
-        <w:jc w:val="left"/>
       </w:pPr>
       <w:r>
         <w:rPr>
-          <w:rFonts w:ascii="Arial" w:hAnsi="Arial"/>
           <w:b/>
-          <w:color w:val="000000"/>
-          <w:sz w:val="20"/>
         </w:rPr>
         <w:t>Stockage Serveur dédié</w:t>
       </w:r>
@@ -1401,14 +1115,10 @@
     <w:p>
       <w:pPr>
         <w:pStyle w:val="DC4thbullet"/>
-        <w:jc w:val="left"/>
       </w:pPr>
       <w:r>
         <w:rPr>
-          <w:rFonts w:ascii="Arial" w:hAnsi="Arial"/>
           <w:b/>
-          <w:color w:val="000000"/>
-          <w:sz w:val="20"/>
         </w:rPr>
         <w:t>Gestion des bases PostgreSQL</w:t>
       </w:r>
@@ -1416,14 +1126,10 @@
     <w:p>
       <w:pPr>
         <w:pStyle w:val="DC4thbullet"/>
-        <w:jc w:val="left"/>
       </w:pPr>
       <w:r>
         <w:rPr>
-          <w:rFonts w:ascii="Arial" w:hAnsi="Arial"/>
           <w:b/>
-          <w:color w:val="000000"/>
-          <w:sz w:val="20"/>
         </w:rPr>
         <w:t>Distribution dans un data model et délivrabilité dans un document éditable avec Docxtpl et Jinja*</w:t>
       </w:r>
@@ -1431,176 +1137,131 @@
     <w:p>
       <w:pPr>
         <w:pStyle w:val="DC2ndbullet"/>
-        <w:jc w:val="left"/>
+      </w:pPr>
+      <w:r>
+        <w:t>Sauvegarde des nouvelles données</w:t>
+      </w:r>
+    </w:p>
+    <w:p>
+      <w:pPr>
+        <w:pStyle w:val="DC2ndbullet"/>
+      </w:pPr>
+      <w:r>
+        <w:t>Dashboard de suivi KPIs avec Power BI</w:t>
+      </w:r>
+    </w:p>
+    <w:p>
+      <w:pPr>
+        <w:pStyle w:val="DC1stbullet"/>
+      </w:pPr>
+      <w:r>
+        <w:t>Applicatif</w:t>
+      </w:r>
+    </w:p>
+    <w:p>
+      <w:pPr>
+        <w:pStyle w:val="DC2ndbullet"/>
+      </w:pPr>
+      <w:r>
+        <w:t>Construction d’une Webapp à destination d’utilisateurs internes à l’entreprise avec le Framework Streamlit</w:t>
+      </w:r>
+    </w:p>
+    <w:p>
+      <w:pPr>
+        <w:pStyle w:val="DC2ndbullet"/>
+      </w:pPr>
+      <w:r>
+        <w:t>Développement applicatif pour la délivrabilité et la visualisation de données</w:t>
+      </w:r>
+    </w:p>
+    <w:p>
+      <w:pPr>
+        <w:pStyle w:val="DC2ndbullet"/>
+      </w:pPr>
+      <w:r>
+        <w:t>Interactions et échanges de données avec des serveurs et base de données (Backend)</w:t>
+      </w:r>
+    </w:p>
+    <w:p>
+      <w:pPr>
+        <w:pStyle w:val="DC2ndbullet"/>
+      </w:pPr>
+      <w:r>
+        <w:t>Interface dynamique et construction de documents de publipostage (Frontend)</w:t>
+      </w:r>
+    </w:p>
+    <w:p>
+      <w:pPr>
+        <w:pStyle w:val="DC2ndbullet"/>
+      </w:pPr>
+      <w:r>
+        <w:t>Démarche UX/UI et optimisation intuitive des actions utilisateurs</w:t>
+      </w:r>
+    </w:p>
+    <w:p>
+      <w:pPr>
+        <w:pStyle w:val="DC2ndbullet"/>
+      </w:pPr>
+      <w:r>
+        <w:t>Tech Lead applicatif, reviews de code et coordination des PRs</w:t>
+      </w:r>
+    </w:p>
+    <w:p>
+      <w:pPr>
+        <w:pStyle w:val="DCNormal"/>
+      </w:pPr>
+    </w:p>
+    <w:p>
+      <w:pPr>
+        <w:pStyle w:val="DCXPBlueContent"/>
       </w:pPr>
       <w:r>
         <w:rPr>
-          <w:rFonts w:ascii="Arial" w:hAnsi="Arial"/>
-          <w:color w:val="000000"/>
-          <w:sz w:val="20"/>
-        </w:rPr>
-        <w:t>Sauvegarde des nouvelles données</w:t>
-      </w:r>
-    </w:p>
-    <w:p>
-      <w:pPr>
-        <w:pStyle w:val="DC2ndbullet"/>
-        <w:jc w:val="left"/>
-      </w:pPr>
-      <w:r>
-        <w:rPr>
-          <w:rFonts w:ascii="Arial" w:hAnsi="Arial"/>
-          <w:color w:val="000000"/>
-          <w:sz w:val="20"/>
-        </w:rPr>
-        <w:t>Dashboard de suivi KPIs avec Power BI</w:t>
-      </w:r>
-    </w:p>
-    <w:p>
-      <w:pPr>
-        <w:pStyle w:val="DC1stbullet"/>
-        <w:jc w:val="left"/>
-      </w:pPr>
-      <w:r>
-        <w:rPr>
-          <w:color w:val="EC7C2F"/>
-        </w:rPr>
-        <w:t>Applicatif</w:t>
-      </w:r>
-    </w:p>
-    <w:p>
-      <w:pPr>
-        <w:pStyle w:val="DC2ndbullet"/>
-        <w:jc w:val="left"/>
-      </w:pPr>
-      <w:r>
-        <w:rPr>
-          <w:rFonts w:ascii="Arial" w:hAnsi="Arial"/>
-          <w:color w:val="000000"/>
-          <w:sz w:val="20"/>
-        </w:rPr>
-        <w:t>Construction d’une Webapp à destination d’utilisateurs internes à l’entreprise avec le Framework Streamlit</w:t>
-      </w:r>
-    </w:p>
-    <w:p>
-      <w:pPr>
-        <w:pStyle w:val="DC2ndbullet"/>
-        <w:jc w:val="left"/>
-      </w:pPr>
-      <w:r>
-        <w:rPr>
-          <w:rFonts w:ascii="Arial" w:hAnsi="Arial"/>
-          <w:color w:val="000000"/>
-          <w:sz w:val="20"/>
-        </w:rPr>
-        <w:t>Développement applicatif pour la délivrabilité et la visualisation de données</w:t>
-      </w:r>
-    </w:p>
-    <w:p>
-      <w:pPr>
-        <w:pStyle w:val="DC2ndbullet"/>
-        <w:jc w:val="left"/>
-      </w:pPr>
-      <w:r>
-        <w:rPr>
-          <w:rFonts w:ascii="Arial" w:hAnsi="Arial"/>
-          <w:color w:val="000000"/>
-          <w:sz w:val="20"/>
-        </w:rPr>
-        <w:t>Interactions et échanges de données avec des serveurs et base de données (Backend)</w:t>
-      </w:r>
-    </w:p>
-    <w:p>
-      <w:pPr>
-        <w:pStyle w:val="DC2ndbullet"/>
-        <w:jc w:val="left"/>
-      </w:pPr>
-      <w:r>
-        <w:rPr>
-          <w:rFonts w:ascii="Arial" w:hAnsi="Arial"/>
-          <w:color w:val="000000"/>
-          <w:sz w:val="20"/>
-        </w:rPr>
-        <w:t>Interface dynamique et construction de documents de publipostage (Frontend)</w:t>
-      </w:r>
-    </w:p>
-    <w:p>
-      <w:pPr>
-        <w:pStyle w:val="DC2ndbullet"/>
-        <w:jc w:val="left"/>
-      </w:pPr>
-      <w:r>
-        <w:rPr>
-          <w:rFonts w:ascii="Arial" w:hAnsi="Arial"/>
-          <w:color w:val="000000"/>
-          <w:sz w:val="20"/>
-        </w:rPr>
-        <w:t>Démarche UX/UI et optimisation intuitive des actions utilisateurs</w:t>
-      </w:r>
-    </w:p>
-    <w:p>
-      <w:pPr>
-        <w:pStyle w:val="DC2ndbullet"/>
-        <w:jc w:val="left"/>
-      </w:pPr>
-      <w:r>
-        <w:rPr>
-          <w:rFonts w:ascii="Arial" w:hAnsi="Arial"/>
-          <w:color w:val="000000"/>
-          <w:sz w:val="20"/>
-        </w:rPr>
-        <w:t>Tech Lead applicatif, reviews de code et coordination des PRs</w:t>
-      </w:r>
-    </w:p>
-    <w:p>
-      <w:pPr>
-        <w:jc w:val="left"/>
-      </w:pPr>
-    </w:p>
-    <w:p>
-      <w:pPr>
-        <w:jc w:val="left"/>
-      </w:pPr>
-      <w:r>
-        <w:rPr>
-          <w:rFonts w:ascii="Arial" w:hAnsi="Arial"/>
           <w:b/>
-          <w:color w:val="538CD4"/>
         </w:rPr>
         <w:t>Environnements techniques : SQL, Python</w:t>
       </w:r>
       <w:r>
-        <w:rPr>
-          <w:rFonts w:ascii="Arial" w:hAnsi="Arial"/>
-          <w:color w:val="538CD4"/>
-        </w:rPr>
         <w:t>, VSCode, Azure DevOps, Jupyter Notebook, PostgreSQL, Streamlit, LucidChart</w:t>
       </w:r>
     </w:p>
     <w:p>
       <w:pPr>
-        <w:jc w:val="left"/>
-      </w:pPr>
-      <w:r>
-        <w:br w:type="page"/>
-      </w:r>
+        <w:pStyle w:val="DCNormal"/>
+      </w:pPr>
     </w:p>
     <w:tbl>
       <w:tblPr>
         <w:tblStyle w:val="Grilledutableau"/>
         <w:tblW w:type="auto" w:w="0"/>
         <w:tblLook w:firstColumn="1" w:firstRow="1" w:lastColumn="0" w:lastRow="0" w:noHBand="0" w:noVBand="1" w:val="04A0"/>
+        <w:tblBorders>
+          <w:top w:val="none" w:sz="0" w:space="0" w:color="auto"/>
+          <w:left w:val="none" w:sz="0" w:space="0" w:color="auto"/>
+          <w:bottom w:val="single" w:sz="10" w:space="0" w:color="000000"/>
+          <w:right w:val="none" w:sz="0" w:space="0" w:color="auto"/>
+          <w:insideH w:val="none" w:sz="0" w:space="0" w:color="auto"/>
+          <w:insideV w:val="none" w:sz="0" w:space="0" w:color="auto"/>
+        </w:tblBorders>
       </w:tblPr>
       <w:tblGrid>
-        <w:gridCol w:w="4986"/>
-        <w:gridCol w:w="4986"/>
+        <w:gridCol w:w="4819"/>
+        <w:gridCol w:w="4819"/>
       </w:tblGrid>
       <w:tr>
+        <w:trPr>
+          <w:trHeight w:val="360"/>
+        </w:trPr>
         <w:tc>
           <w:tcPr>
-            <w:tcW w:type="dxa" w:w="4986"/>
+            <w:tcW w:type="dxa" w:w="6803"/>
+            <w:vAlign w:val="center"/>
           </w:tcPr>
           <w:p>
+            <w:pPr>
+              <w:pStyle w:val="DCXPTitle"/>
+              <w:jc w:val="left"/>
+            </w:pPr>
             <w:r>
               <w:t>Data For Good</w:t>
             </w:r>
@@ -1608,9 +1269,14 @@
         </w:tc>
         <w:tc>
           <w:tcPr>
-            <w:tcW w:type="dxa" w:w="4986"/>
+            <w:tcW w:type="dxa" w:w="2835"/>
+            <w:vAlign w:val="center"/>
           </w:tcPr>
           <w:p>
+            <w:pPr>
+              <w:pStyle w:val="DCXPDate"/>
+              <w:jc w:val="right"/>
+            </w:pPr>
             <w:r>
               <w:rPr>
                 <w:b/>
@@ -1622,11 +1288,19 @@
         </w:tc>
       </w:tr>
       <w:tr>
+        <w:trPr>
+          <w:trHeight w:val="360"/>
+        </w:trPr>
         <w:tc>
           <w:tcPr>
-            <w:tcW w:type="dxa" w:w="4986"/>
+            <w:tcW w:type="dxa" w:w="6803"/>
+            <w:vAlign w:val="center"/>
           </w:tcPr>
           <w:p>
+            <w:pPr>
+              <w:pStyle w:val="DCXPPoste"/>
+              <w:jc w:val="left"/>
+            </w:pPr>
             <w:r>
               <w:rPr>
                 <w:b/>
@@ -1637,7 +1311,8 @@
         </w:tc>
         <w:tc>
           <w:tcPr>
-            <w:tcW w:type="dxa" w:w="4986"/>
+            <w:tcW w:type="dxa" w:w="2835"/>
+            <w:vAlign w:val="center"/>
           </w:tcPr>
           <w:p/>
         </w:tc>
@@ -1645,255 +1320,158 @@
     </w:tbl>
     <w:p>
       <w:pPr>
-        <w:jc w:val="left"/>
+        <w:pStyle w:val="DCNormal"/>
+      </w:pPr>
+    </w:p>
+    <w:p>
+      <w:pPr>
+        <w:pStyle w:val="DCNormal"/>
       </w:pPr>
       <w:r>
         <w:rPr>
-          <w:rFonts w:ascii="Arial" w:hAnsi="Arial"/>
           <w:b/>
-          <w:color w:val="000000"/>
-          <w:sz w:val="20"/>
         </w:rPr>
         <w:t xml:space="preserve">Contexte : </w:t>
       </w:r>
       <w:r>
+        <w:t>Je mène des projets en tant que Data Analyst ou Data Engineer, de manière bénévole, pour la communauté Data For Good, à destination de partenaires associatifs ou d’ONGs : MEDCAP, Eclaireur public, ODIS, Algoboost, QPPCC</w:t>
+      </w:r>
+    </w:p>
+    <w:p>
+      <w:pPr>
+        <w:pStyle w:val="DC1stbullet"/>
+      </w:pPr>
+      <w:r>
+        <w:t>Gestion de projets</w:t>
+      </w:r>
+    </w:p>
+    <w:p>
+      <w:pPr>
+        <w:pStyle w:val="DC2ndbullet"/>
+      </w:pPr>
+      <w:r>
+        <w:t>Recueil des besoins, des contraintes et spécifications</w:t>
+      </w:r>
+    </w:p>
+    <w:p>
+      <w:pPr>
+        <w:pStyle w:val="DC2ndbullet"/>
+      </w:pPr>
+      <w:r>
+        <w:t xml:space="preserve">Etude et proposition de solutions techniques </w:t>
+      </w:r>
+    </w:p>
+    <w:p>
+      <w:pPr>
+        <w:pStyle w:val="DC2ndbullet"/>
+      </w:pPr>
+      <w:r>
+        <w:t>Construction et mise à jour du Kanban de projet, Méthodologie Agile</w:t>
+      </w:r>
+    </w:p>
+    <w:p>
+      <w:pPr>
+        <w:pStyle w:val="DC2ndbullet"/>
+      </w:pPr>
+      <w:r>
+        <w:t>Communication avec les équipes, organisation des réunions</w:t>
+      </w:r>
+    </w:p>
+    <w:p>
+      <w:pPr>
+        <w:pStyle w:val="DC2ndbullet"/>
+      </w:pPr>
+      <w:r>
+        <w:t xml:space="preserve">Rédaction de préconisations métiers </w:t>
+      </w:r>
+    </w:p>
+    <w:p>
+      <w:pPr>
+        <w:pStyle w:val="DC2ndbullet"/>
+      </w:pPr>
+      <w:r>
+        <w:t>Reportings</w:t>
+      </w:r>
+    </w:p>
+    <w:p>
+      <w:pPr>
+        <w:pStyle w:val="DC1stbullet"/>
+      </w:pPr>
+      <w:r>
+        <w:t>Collecte des données</w:t>
+      </w:r>
+    </w:p>
+    <w:p>
+      <w:pPr>
+        <w:pStyle w:val="DC2ndbullet"/>
+      </w:pPr>
+      <w:r>
+        <w:t>Etudes des sources possibles de collecte de données, Open Data</w:t>
+      </w:r>
+    </w:p>
+    <w:p>
+      <w:pPr>
+        <w:pStyle w:val="DC2ndbullet"/>
+      </w:pPr>
+      <w:r>
+        <w:t xml:space="preserve">Requêtes APIs </w:t>
+      </w:r>
+    </w:p>
+    <w:p>
+      <w:pPr>
+        <w:pStyle w:val="DC2ndbullet"/>
+      </w:pPr>
+      <w:r>
+        <w:t xml:space="preserve">Conception des modèles de données </w:t>
+      </w:r>
+    </w:p>
+    <w:p>
+      <w:pPr>
+        <w:pStyle w:val="DC2ndbullet"/>
+      </w:pPr>
+      <w:r>
+        <w:t>Parsing Python depuis des bases de données NoSQL</w:t>
+      </w:r>
+    </w:p>
+    <w:p>
+      <w:pPr>
+        <w:pStyle w:val="DC2ndbullet"/>
+      </w:pPr>
+      <w:r>
+        <w:t>Traitements de données en Python Pandas</w:t>
+      </w:r>
+    </w:p>
+    <w:p>
+      <w:pPr>
+        <w:pStyle w:val="DC2ndbullet"/>
+      </w:pPr>
+      <w:r>
+        <w:t>Construction d’un pipeline dynamique de données socio-économiques</w:t>
+      </w:r>
+    </w:p>
+    <w:p>
+      <w:pPr>
+        <w:pStyle w:val="DC2ndbullet"/>
+      </w:pPr>
+      <w:r>
+        <w:t>Extract and Load des données en process CLI avec Python</w:t>
+      </w:r>
+    </w:p>
+    <w:p>
+      <w:pPr>
+        <w:pStyle w:val="DC1stbullet"/>
+      </w:pPr>
+      <w:r>
+        <w:t>Traitement des bases de données</w:t>
+      </w:r>
+    </w:p>
+    <w:p>
+      <w:pPr>
+        <w:pStyle w:val="DC2ndbullet"/>
+      </w:pPr>
+      <w:r>
         <w:rPr>
-          <w:rFonts w:ascii="Arial" w:hAnsi="Arial"/>
-          <w:color w:val="000000"/>
-          <w:sz w:val="20"/>
-        </w:rPr>
-        <w:t>Je mène des projets en tant que Data Analyst ou Data Engineer, de manière bénévole, pour la communauté Data For Good, à destination de partenaires associatifs ou d’ONGs : MEDCAP, Eclaireur public, ODIS, Algoboost, QPPCC</w:t>
-      </w:r>
-    </w:p>
-    <w:p>
-      <w:pPr>
-        <w:pStyle w:val="DC1stbullet"/>
-        <w:jc w:val="left"/>
-      </w:pPr>
-      <w:r>
-        <w:rPr>
-          <w:color w:val="EC7C2F"/>
-        </w:rPr>
-        <w:t>Gestion de projets</w:t>
-      </w:r>
-    </w:p>
-    <w:p>
-      <w:pPr>
-        <w:pStyle w:val="DC2ndbullet"/>
-        <w:jc w:val="left"/>
-      </w:pPr>
-      <w:r>
-        <w:rPr>
-          <w:rFonts w:ascii="Arial" w:hAnsi="Arial"/>
-          <w:color w:val="000000"/>
-          <w:sz w:val="20"/>
-        </w:rPr>
-        <w:t>Recueil des besoins, des contraintes et spécifications</w:t>
-      </w:r>
-    </w:p>
-    <w:p>
-      <w:pPr>
-        <w:pStyle w:val="DC2ndbullet"/>
-        <w:jc w:val="left"/>
-      </w:pPr>
-      <w:r>
-        <w:rPr>
-          <w:rFonts w:ascii="Arial" w:hAnsi="Arial"/>
-          <w:color w:val="000000"/>
-          <w:sz w:val="20"/>
-        </w:rPr>
-        <w:t xml:space="preserve">Etude et proposition de solutions techniques </w:t>
-      </w:r>
-    </w:p>
-    <w:p>
-      <w:pPr>
-        <w:pStyle w:val="DC2ndbullet"/>
-        <w:jc w:val="left"/>
-      </w:pPr>
-      <w:r>
-        <w:rPr>
-          <w:rFonts w:ascii="Arial" w:hAnsi="Arial"/>
-          <w:color w:val="000000"/>
-          <w:sz w:val="20"/>
-        </w:rPr>
-        <w:t>Construction et mise à jour du Kanban de projet, Méthodologie Agile</w:t>
-      </w:r>
-    </w:p>
-    <w:p>
-      <w:pPr>
-        <w:pStyle w:val="DC2ndbullet"/>
-        <w:jc w:val="left"/>
-      </w:pPr>
-      <w:r>
-        <w:rPr>
-          <w:rFonts w:ascii="Arial" w:hAnsi="Arial"/>
-          <w:color w:val="000000"/>
-          <w:sz w:val="20"/>
-        </w:rPr>
-        <w:t>Communication avec les équipes, organisation des réunions</w:t>
-      </w:r>
-    </w:p>
-    <w:p>
-      <w:pPr>
-        <w:pStyle w:val="DC2ndbullet"/>
-        <w:jc w:val="left"/>
-      </w:pPr>
-      <w:r>
-        <w:rPr>
-          <w:rFonts w:ascii="Arial" w:hAnsi="Arial"/>
-          <w:color w:val="000000"/>
-          <w:sz w:val="20"/>
-        </w:rPr>
-        <w:t xml:space="preserve">Rédaction de préconisations métiers </w:t>
-      </w:r>
-    </w:p>
-    <w:p>
-      <w:pPr>
-        <w:pStyle w:val="DC2ndbullet"/>
-        <w:jc w:val="left"/>
-      </w:pPr>
-      <w:r>
-        <w:rPr>
-          <w:rFonts w:ascii="Arial" w:hAnsi="Arial"/>
-          <w:color w:val="000000"/>
-          <w:sz w:val="20"/>
-        </w:rPr>
-        <w:t>Reportings</w:t>
-      </w:r>
-    </w:p>
-    <w:p>
-      <w:pPr>
-        <w:pStyle w:val="DC1stbullet"/>
-        <w:jc w:val="left"/>
-      </w:pPr>
-      <w:r>
-        <w:rPr>
-          <w:color w:val="EC7C2F"/>
-        </w:rPr>
-        <w:t>Collecte des données</w:t>
-      </w:r>
-    </w:p>
-    <w:p>
-      <w:pPr>
-        <w:pStyle w:val="DC2ndbullet"/>
-        <w:jc w:val="left"/>
-      </w:pPr>
-      <w:r>
-        <w:rPr>
-          <w:rFonts w:ascii="Arial" w:hAnsi="Arial"/>
-          <w:color w:val="000000"/>
-          <w:sz w:val="20"/>
-        </w:rPr>
-        <w:t>Etudes des sources possibles de collecte de données, Open Data</w:t>
-      </w:r>
-    </w:p>
-    <w:p>
-      <w:pPr>
-        <w:pStyle w:val="DC2ndbullet"/>
-        <w:jc w:val="left"/>
-      </w:pPr>
-      <w:r>
-        <w:rPr>
-          <w:rFonts w:ascii="Arial" w:hAnsi="Arial"/>
-          <w:color w:val="000000"/>
-          <w:sz w:val="20"/>
-        </w:rPr>
-        <w:t xml:space="preserve">Requêtes APIs </w:t>
-      </w:r>
-    </w:p>
-    <w:p>
-      <w:pPr>
-        <w:pStyle w:val="DC2ndbullet"/>
-        <w:jc w:val="left"/>
-      </w:pPr>
-      <w:r>
-        <w:rPr>
-          <w:rFonts w:ascii="Arial" w:hAnsi="Arial"/>
-          <w:color w:val="000000"/>
-          <w:sz w:val="20"/>
-        </w:rPr>
-        <w:t xml:space="preserve">Conception des modèles de données </w:t>
-      </w:r>
-    </w:p>
-    <w:p>
-      <w:pPr>
-        <w:pStyle w:val="DC2ndbullet"/>
-        <w:jc w:val="left"/>
-      </w:pPr>
-      <w:r>
-        <w:rPr>
-          <w:rFonts w:ascii="Arial" w:hAnsi="Arial"/>
-          <w:color w:val="000000"/>
-          <w:sz w:val="20"/>
-        </w:rPr>
-        <w:t>Parsing Python depuis des bases de données NoSQL</w:t>
-      </w:r>
-    </w:p>
-    <w:p>
-      <w:pPr>
-        <w:pStyle w:val="DC2ndbullet"/>
-        <w:jc w:val="left"/>
-      </w:pPr>
-      <w:r>
-        <w:rPr>
-          <w:rFonts w:ascii="Arial" w:hAnsi="Arial"/>
-          <w:color w:val="000000"/>
-          <w:sz w:val="20"/>
-        </w:rPr>
-        <w:t>Traitements de données en Python Pandas</w:t>
-      </w:r>
-    </w:p>
-    <w:p>
-      <w:pPr>
-        <w:pStyle w:val="DC2ndbullet"/>
-        <w:jc w:val="left"/>
-      </w:pPr>
-      <w:r>
-        <w:rPr>
-          <w:rFonts w:ascii="Arial" w:hAnsi="Arial"/>
-          <w:color w:val="000000"/>
-          <w:sz w:val="20"/>
-        </w:rPr>
-        <w:t>Construction d’un pipeline dynamique de données socio-économiques</w:t>
-      </w:r>
-    </w:p>
-    <w:p>
-      <w:pPr>
-        <w:pStyle w:val="DC2ndbullet"/>
-        <w:jc w:val="left"/>
-      </w:pPr>
-      <w:r>
-        <w:rPr>
-          <w:rFonts w:ascii="Arial" w:hAnsi="Arial"/>
-          <w:color w:val="000000"/>
-          <w:sz w:val="20"/>
-        </w:rPr>
-        <w:t>Extract and Load des données en process CLI avec Python</w:t>
-      </w:r>
-    </w:p>
-    <w:p>
-      <w:pPr>
-        <w:pStyle w:val="DC1stbullet"/>
-        <w:jc w:val="left"/>
-      </w:pPr>
-      <w:r>
-        <w:rPr>
-          <w:color w:val="EC7C2F"/>
-        </w:rPr>
-        <w:t>Traitement des bases de données</w:t>
-      </w:r>
-    </w:p>
-    <w:p>
-      <w:pPr>
-        <w:pStyle w:val="DC2ndbullet"/>
-        <w:jc w:val="left"/>
-      </w:pPr>
-      <w:r>
-        <w:rPr>
-          <w:rFonts w:ascii="Arial" w:hAnsi="Arial"/>
           <w:b/>
-          <w:color w:val="000000"/>
-          <w:sz w:val="20"/>
         </w:rPr>
         <w:t>Traitements des données :</w:t>
       </w:r>
@@ -1901,14 +1479,10 @@
     <w:p>
       <w:pPr>
         <w:pStyle w:val="DC4thbullet"/>
-        <w:jc w:val="left"/>
       </w:pPr>
       <w:r>
         <w:rPr>
-          <w:rFonts w:ascii="Arial" w:hAnsi="Arial"/>
           <w:b/>
-          <w:color w:val="000000"/>
-          <w:sz w:val="20"/>
         </w:rPr>
         <w:t>Stockage Local ou Cloud</w:t>
       </w:r>
@@ -1916,14 +1490,10 @@
     <w:p>
       <w:pPr>
         <w:pStyle w:val="DC4thbullet"/>
-        <w:jc w:val="left"/>
       </w:pPr>
       <w:r>
         <w:rPr>
-          <w:rFonts w:ascii="Arial" w:hAnsi="Arial"/>
           <w:b/>
-          <w:color w:val="000000"/>
-          <w:sz w:val="20"/>
         </w:rPr>
         <w:t>Gestion des bases PostgreSQL, Duck DB</w:t>
       </w:r>
@@ -1931,14 +1501,10 @@
     <w:p>
       <w:pPr>
         <w:pStyle w:val="DC4thbullet"/>
-        <w:jc w:val="left"/>
       </w:pPr>
       <w:r>
         <w:rPr>
-          <w:rFonts w:ascii="Arial" w:hAnsi="Arial"/>
           <w:b/>
-          <w:color w:val="000000"/>
-          <w:sz w:val="20"/>
         </w:rPr>
         <w:t>Assemblages et Transformations</w:t>
       </w:r>
@@ -1946,14 +1512,10 @@
     <w:p>
       <w:pPr>
         <w:pStyle w:val="DC4thbullet"/>
-        <w:jc w:val="left"/>
       </w:pPr>
       <w:r>
         <w:rPr>
-          <w:rFonts w:ascii="Arial" w:hAnsi="Arial"/>
           <w:b/>
-          <w:color w:val="000000"/>
-          <w:sz w:val="20"/>
         </w:rPr>
         <w:t>Séquençage DBT</w:t>
       </w:r>
@@ -1961,14 +1523,10 @@
     <w:p>
       <w:pPr>
         <w:pStyle w:val="DC4thbullet"/>
-        <w:jc w:val="left"/>
       </w:pPr>
       <w:r>
         <w:rPr>
-          <w:rFonts w:ascii="Arial" w:hAnsi="Arial"/>
           <w:b/>
-          <w:color w:val="000000"/>
-          <w:sz w:val="20"/>
         </w:rPr>
         <w:t>Automatisation CLI ou Prefect</w:t>
       </w:r>
@@ -1976,14 +1534,10 @@
     <w:p>
       <w:pPr>
         <w:pStyle w:val="DC4thbullet"/>
-        <w:jc w:val="left"/>
       </w:pPr>
       <w:r>
         <w:rPr>
-          <w:rFonts w:ascii="Arial" w:hAnsi="Arial"/>
           <w:b/>
-          <w:color w:val="000000"/>
-          <w:sz w:val="20"/>
         </w:rPr>
         <w:t>Architecture Databricks Médaillon</w:t>
       </w:r>
@@ -1991,86 +1545,49 @@
     <w:p>
       <w:pPr>
         <w:pStyle w:val="DC2ndbullet"/>
-        <w:jc w:val="left"/>
+      </w:pPr>
+      <w:r>
+        <w:t>Construction de data visualisations avec Python</w:t>
+      </w:r>
+    </w:p>
+    <w:p>
+      <w:pPr>
+        <w:pStyle w:val="DC2ndbullet"/>
+      </w:pPr>
+      <w:r>
+        <w:t>Implémentation dans une application existante, tests de data visualisation, corrections</w:t>
+      </w:r>
+    </w:p>
+    <w:p>
+      <w:pPr>
+        <w:pStyle w:val="DC2ndbullet"/>
+      </w:pPr>
+      <w:r>
+        <w:t>Entrainement de modèles ML, graphes prévisionnels</w:t>
+      </w:r>
+    </w:p>
+    <w:p>
+      <w:pPr>
+        <w:pStyle w:val="DCNormal"/>
+      </w:pPr>
+    </w:p>
+    <w:p>
+      <w:pPr>
+        <w:pStyle w:val="DCXPBlueContent"/>
       </w:pPr>
       <w:r>
         <w:rPr>
-          <w:rFonts w:ascii="Arial" w:hAnsi="Arial"/>
-          <w:color w:val="000000"/>
-          <w:sz w:val="20"/>
-        </w:rPr>
-        <w:t>Construction de data visualisations avec Python</w:t>
-      </w:r>
-    </w:p>
-    <w:p>
-      <w:pPr>
-        <w:pStyle w:val="DC2ndbullet"/>
-        <w:jc w:val="left"/>
-      </w:pPr>
-      <w:r>
-        <w:rPr>
-          <w:rFonts w:ascii="Arial" w:hAnsi="Arial"/>
-          <w:color w:val="000000"/>
-          <w:sz w:val="20"/>
-        </w:rPr>
-        <w:t>Implémentation dans une application existante, tests de data visualisation, corrections</w:t>
-      </w:r>
-    </w:p>
-    <w:p>
-      <w:pPr>
-        <w:pStyle w:val="DC2ndbullet"/>
-        <w:jc w:val="left"/>
-      </w:pPr>
-      <w:r>
-        <w:rPr>
-          <w:rFonts w:ascii="Arial" w:hAnsi="Arial"/>
-          <w:color w:val="000000"/>
-          <w:sz w:val="20"/>
-        </w:rPr>
-        <w:t>Entrainement de modèles ML, graphes prévisionnels</w:t>
-      </w:r>
-    </w:p>
-    <w:p>
-      <w:pPr>
-        <w:jc w:val="left"/>
-      </w:pPr>
-    </w:p>
-    <w:p>
-      <w:pPr>
-        <w:jc w:val="left"/>
-      </w:pPr>
-    </w:p>
-    <w:p>
-      <w:pPr>
-        <w:jc w:val="left"/>
-      </w:pPr>
-      <w:r>
-        <w:rPr>
-          <w:rFonts w:ascii="Arial" w:hAnsi="Arial"/>
           <w:b/>
-          <w:color w:val="538CD4"/>
         </w:rPr>
         <w:t>Environnements techniques : SQL, Python</w:t>
       </w:r>
       <w:r>
-        <w:rPr>
-          <w:rFonts w:ascii="Arial" w:hAnsi="Arial"/>
-          <w:color w:val="538CD4"/>
-        </w:rPr>
         <w:t>, VSCode, Github, DBT Cloud, DBT Core, Jupyter Notebook, Google Cloud Platform, AWS S3, DuckDB, PostgreSQL, Streamlit, Slack, Mattermost, Github Issues, Notion, Outline</w:t>
       </w:r>
     </w:p>
     <w:p>
       <w:pPr>
-        <w:jc w:val="left"/>
-      </w:pPr>
-      <w:r>
-        <w:br w:type="page"/>
-      </w:r>
-    </w:p>
-    <w:p>
-      <w:pPr>
-        <w:jc w:val="left"/>
+        <w:pStyle w:val="DCNormal"/>
       </w:pPr>
     </w:p>
     <w:tbl>
@@ -2078,17 +1595,33 @@
         <w:tblStyle w:val="Grilledutableau"/>
         <w:tblW w:type="auto" w:w="0"/>
         <w:tblLook w:firstColumn="1" w:firstRow="1" w:lastColumn="0" w:lastRow="0" w:noHBand="0" w:noVBand="1" w:val="04A0"/>
+        <w:tblBorders>
+          <w:top w:val="none" w:sz="0" w:space="0" w:color="auto"/>
+          <w:left w:val="none" w:sz="0" w:space="0" w:color="auto"/>
+          <w:bottom w:val="single" w:sz="10" w:space="0" w:color="000000"/>
+          <w:right w:val="none" w:sz="0" w:space="0" w:color="auto"/>
+          <w:insideH w:val="none" w:sz="0" w:space="0" w:color="auto"/>
+          <w:insideV w:val="none" w:sz="0" w:space="0" w:color="auto"/>
+        </w:tblBorders>
       </w:tblPr>
       <w:tblGrid>
-        <w:gridCol w:w="4986"/>
-        <w:gridCol w:w="4986"/>
+        <w:gridCol w:w="4819"/>
+        <w:gridCol w:w="4819"/>
       </w:tblGrid>
       <w:tr>
+        <w:trPr>
+          <w:trHeight w:val="360"/>
+        </w:trPr>
         <w:tc>
           <w:tcPr>
-            <w:tcW w:type="dxa" w:w="4986"/>
+            <w:tcW w:type="dxa" w:w="6803"/>
+            <w:vAlign w:val="center"/>
           </w:tcPr>
           <w:p>
+            <w:pPr>
+              <w:pStyle w:val="DCXPTitle"/>
+              <w:jc w:val="left"/>
+            </w:pPr>
             <w:r>
               <w:t>KEYOR, Bordeaux</w:t>
             </w:r>
@@ -2096,9 +1629,14 @@
         </w:tc>
         <w:tc>
           <w:tcPr>
-            <w:tcW w:type="dxa" w:w="4986"/>
+            <w:tcW w:type="dxa" w:w="2835"/>
+            <w:vAlign w:val="center"/>
           </w:tcPr>
           <w:p>
+            <w:pPr>
+              <w:pStyle w:val="DCXPDate"/>
+              <w:jc w:val="right"/>
+            </w:pPr>
             <w:r>
               <w:rPr>
                 <w:b/>
@@ -2110,11 +1648,19 @@
         </w:tc>
       </w:tr>
       <w:tr>
+        <w:trPr>
+          <w:trHeight w:val="360"/>
+        </w:trPr>
         <w:tc>
           <w:tcPr>
-            <w:tcW w:type="dxa" w:w="4986"/>
+            <w:tcW w:type="dxa" w:w="6803"/>
+            <w:vAlign w:val="center"/>
           </w:tcPr>
           <w:p>
+            <w:pPr>
+              <w:pStyle w:val="DCXPPoste"/>
+              <w:jc w:val="left"/>
+            </w:pPr>
             <w:r>
               <w:rPr>
                 <w:b/>
@@ -2125,7 +1671,8 @@
         </w:tc>
         <w:tc>
           <w:tcPr>
-            <w:tcW w:type="dxa" w:w="4986"/>
+            <w:tcW w:type="dxa" w:w="2835"/>
+            <w:vAlign w:val="center"/>
           </w:tcPr>
           <w:p/>
         </w:tc>
@@ -2133,187 +1680,118 @@
     </w:tbl>
     <w:p>
       <w:pPr>
-        <w:jc w:val="left"/>
+        <w:pStyle w:val="DCNormal"/>
+      </w:pPr>
+    </w:p>
+    <w:p>
+      <w:pPr>
+        <w:pStyle w:val="DCNormal"/>
       </w:pPr>
       <w:r>
         <w:rPr>
-          <w:rFonts w:ascii="Arial" w:hAnsi="Arial"/>
           <w:b/>
-          <w:color w:val="000000"/>
-          <w:sz w:val="20"/>
         </w:rPr>
         <w:t xml:space="preserve">Contexte : </w:t>
       </w:r>
       <w:r>
+        <w:t>J’ai rejoint Keyor qui est une entreprise de conception et fabrication de menuiseries afin de prendre en charge l’ensemble des projets data. J’ai notamment travaillé avec les équipes R&amp;D sur le traitement des données techniques liées aux différents produits.</w:t>
+      </w:r>
+    </w:p>
+    <w:p>
+      <w:pPr>
+        <w:pStyle w:val="DC1stbullet"/>
+      </w:pPr>
+      <w:r>
+        <w:t>Gestion de projets</w:t>
+      </w:r>
+    </w:p>
+    <w:p>
+      <w:pPr>
+        <w:pStyle w:val="DC2ndbullet"/>
+      </w:pPr>
+      <w:r>
+        <w:t>Recueil des besoins</w:t>
+      </w:r>
+    </w:p>
+    <w:p>
+      <w:pPr>
+        <w:pStyle w:val="DC2ndbullet"/>
+      </w:pPr>
+      <w:r>
+        <w:t>Participation au cahier des charges avec les métiers</w:t>
+      </w:r>
+    </w:p>
+    <w:p>
+      <w:pPr>
+        <w:pStyle w:val="DC2ndbullet"/>
+      </w:pPr>
+      <w:r>
+        <w:t>Analyse de faisabilité et préconisations</w:t>
+      </w:r>
+    </w:p>
+    <w:p>
+      <w:pPr>
+        <w:pStyle w:val="DC2ndbullet"/>
+      </w:pPr>
+      <w:r>
+        <w:t>Ecriture des livrables</w:t>
+      </w:r>
+    </w:p>
+    <w:p>
+      <w:pPr>
+        <w:pStyle w:val="DC2ndbullet"/>
+      </w:pPr>
+      <w:r>
+        <w:t>Suivi de projets et avancements</w:t>
+      </w:r>
+    </w:p>
+    <w:p>
+      <w:pPr>
+        <w:pStyle w:val="DC2ndbullet"/>
+      </w:pPr>
+      <w:r>
+        <w:t>Echanges transverses entre services</w:t>
+      </w:r>
+    </w:p>
+    <w:p>
+      <w:pPr>
+        <w:pStyle w:val="DC2ndbullet"/>
+      </w:pPr>
+      <w:r>
+        <w:t>Reportings</w:t>
+      </w:r>
+    </w:p>
+    <w:p>
+      <w:pPr>
+        <w:pStyle w:val="DC1stbullet"/>
+      </w:pPr>
+      <w:r>
+        <w:t>Collecte des données</w:t>
+      </w:r>
+    </w:p>
+    <w:p>
+      <w:pPr>
+        <w:pStyle w:val="DC2ndbullet"/>
+      </w:pPr>
+      <w:r>
+        <w:t>Collecte des données spécifiques aux métiers : multisources</w:t>
+      </w:r>
+    </w:p>
+    <w:p>
+      <w:pPr>
+        <w:pStyle w:val="DC2ndbullet"/>
+      </w:pPr>
+      <w:r>
+        <w:t>Réceptionner, trier, nettoyer les données</w:t>
+      </w:r>
+    </w:p>
+    <w:p>
+      <w:pPr>
+        <w:pStyle w:val="DC2ndbullet"/>
+      </w:pPr>
+      <w:r>
         <w:rPr>
-          <w:rFonts w:ascii="Arial" w:hAnsi="Arial"/>
-          <w:color w:val="000000"/>
-          <w:sz w:val="20"/>
-        </w:rPr>
-        <w:t>J’ai rejoint Keyor qui est une entreprise de conception et fabrication de menuiseries afin de prendre en charge l’ensemble des projets data. J’ai notamment travaillé avec les équipes R&amp;D sur le traitement des données techniques liées aux différents produits.</w:t>
-      </w:r>
-    </w:p>
-    <w:p>
-      <w:pPr>
-        <w:pStyle w:val="DC1stbullet"/>
-        <w:jc w:val="left"/>
-      </w:pPr>
-      <w:r>
-        <w:rPr>
-          <w:color w:val="EC7C2F"/>
-        </w:rPr>
-        <w:t>Gestion de projets</w:t>
-      </w:r>
-    </w:p>
-    <w:p>
-      <w:pPr>
-        <w:pStyle w:val="DC2ndbullet"/>
-        <w:jc w:val="left"/>
-      </w:pPr>
-      <w:r>
-        <w:rPr>
-          <w:rFonts w:ascii="Arial" w:hAnsi="Arial"/>
-          <w:color w:val="000000"/>
-          <w:sz w:val="20"/>
-        </w:rPr>
-        <w:t>Recueil des besoins</w:t>
-      </w:r>
-    </w:p>
-    <w:p>
-      <w:pPr>
-        <w:pStyle w:val="DC2ndbullet"/>
-        <w:jc w:val="left"/>
-      </w:pPr>
-      <w:r>
-        <w:rPr>
-          <w:rFonts w:ascii="Arial" w:hAnsi="Arial"/>
-          <w:color w:val="000000"/>
-          <w:sz w:val="20"/>
-        </w:rPr>
-        <w:t>Participation au cahier des charges avec les métiers</w:t>
-      </w:r>
-    </w:p>
-    <w:p>
-      <w:pPr>
-        <w:pStyle w:val="DC2ndbullet"/>
-        <w:jc w:val="left"/>
-      </w:pPr>
-      <w:r>
-        <w:rPr>
-          <w:rFonts w:ascii="Arial" w:hAnsi="Arial"/>
-          <w:color w:val="000000"/>
-          <w:sz w:val="20"/>
-        </w:rPr>
-        <w:t>Analyse de faisabilité et préconisations</w:t>
-      </w:r>
-    </w:p>
-    <w:p>
-      <w:pPr>
-        <w:pStyle w:val="DC2ndbullet"/>
-        <w:jc w:val="left"/>
-      </w:pPr>
-      <w:r>
-        <w:rPr>
-          <w:rFonts w:ascii="Arial" w:hAnsi="Arial"/>
-          <w:color w:val="000000"/>
-          <w:sz w:val="20"/>
-        </w:rPr>
-        <w:t>Ecriture des livrables</w:t>
-      </w:r>
-    </w:p>
-    <w:p>
-      <w:pPr>
-        <w:pStyle w:val="DC2ndbullet"/>
-        <w:jc w:val="left"/>
-      </w:pPr>
-      <w:r>
-        <w:rPr>
-          <w:rFonts w:ascii="Arial" w:hAnsi="Arial"/>
-          <w:color w:val="000000"/>
-          <w:sz w:val="20"/>
-        </w:rPr>
-        <w:t>Suivi de projets et avancements</w:t>
-      </w:r>
-    </w:p>
-    <w:p>
-      <w:pPr>
-        <w:pStyle w:val="DC2ndbullet"/>
-        <w:jc w:val="left"/>
-      </w:pPr>
-      <w:r>
-        <w:rPr>
-          <w:rFonts w:ascii="Arial" w:hAnsi="Arial"/>
-          <w:color w:val="000000"/>
-          <w:sz w:val="20"/>
-        </w:rPr>
-        <w:t>Echanges transverses entre services</w:t>
-      </w:r>
-    </w:p>
-    <w:p>
-      <w:pPr>
-        <w:pStyle w:val="DC2ndbullet"/>
-        <w:jc w:val="left"/>
-      </w:pPr>
-      <w:r>
-        <w:rPr>
-          <w:rFonts w:ascii="Arial" w:hAnsi="Arial"/>
-          <w:color w:val="000000"/>
-          <w:sz w:val="20"/>
-        </w:rPr>
-        <w:t>Reportings</w:t>
-      </w:r>
-    </w:p>
-    <w:p>
-      <w:pPr>
-        <w:pStyle w:val="DC1stbullet"/>
-        <w:jc w:val="left"/>
-      </w:pPr>
-      <w:r>
-        <w:rPr>
-          <w:color w:val="EC7C2F"/>
-        </w:rPr>
-        <w:t>Collecte des données</w:t>
-      </w:r>
-    </w:p>
-    <w:p>
-      <w:pPr>
-        <w:pStyle w:val="DC2ndbullet"/>
-        <w:jc w:val="left"/>
-      </w:pPr>
-      <w:r>
-        <w:rPr>
-          <w:rFonts w:ascii="Arial" w:hAnsi="Arial"/>
-          <w:color w:val="000000"/>
-          <w:sz w:val="20"/>
-        </w:rPr>
-        <w:t>Collecte des données spécifiques aux métiers : multisources</w:t>
-      </w:r>
-    </w:p>
-    <w:p>
-      <w:pPr>
-        <w:pStyle w:val="DC2ndbullet"/>
-        <w:jc w:val="left"/>
-      </w:pPr>
-      <w:r>
-        <w:rPr>
-          <w:rFonts w:ascii="Arial" w:hAnsi="Arial"/>
-          <w:color w:val="000000"/>
-          <w:sz w:val="20"/>
-        </w:rPr>
-        <w:t>Réceptionner, trier, nettoyer les données</w:t>
-      </w:r>
-    </w:p>
-    <w:p>
-      <w:pPr>
-        <w:pStyle w:val="DC2ndbullet"/>
-        <w:jc w:val="left"/>
-      </w:pPr>
-      <w:r>
-        <w:rPr>
-          <w:rFonts w:ascii="Arial" w:hAnsi="Arial"/>
           <w:b/>
-          <w:color w:val="000000"/>
-          <w:sz w:val="20"/>
         </w:rPr>
         <w:t>Implémentation d’une data gouvernance :</w:t>
       </w:r>
@@ -2321,70 +1799,42 @@
     <w:p>
       <w:pPr>
         <w:pStyle w:val="DC4thbullet"/>
-        <w:jc w:val="left"/>
+      </w:pPr>
+      <w:r>
+        <w:t>Etude des compétences et besoins métiers</w:t>
+      </w:r>
+    </w:p>
+    <w:p>
+      <w:pPr>
+        <w:pStyle w:val="DC4thbullet"/>
+      </w:pPr>
+      <w:r>
+        <w:t>Conception des outils et indicateurs à mettre à disposition</w:t>
+      </w:r>
+    </w:p>
+    <w:p>
+      <w:pPr>
+        <w:pStyle w:val="DC4thbullet"/>
+      </w:pPr>
+      <w:r>
+        <w:t>Correction et optimisation des pipelines de données</w:t>
+      </w:r>
+    </w:p>
+    <w:p>
+      <w:pPr>
+        <w:pStyle w:val="DC4thbullet"/>
+      </w:pPr>
+      <w:r>
+        <w:t>Coordination entre les services</w:t>
+      </w:r>
+    </w:p>
+    <w:p>
+      <w:pPr>
+        <w:pStyle w:val="DC2ndbullet"/>
       </w:pPr>
       <w:r>
         <w:rPr>
-          <w:rFonts w:ascii="Arial" w:hAnsi="Arial"/>
-          <w:color w:val="000000"/>
-          <w:sz w:val="20"/>
-        </w:rPr>
-        <w:t>Etude des compétences et besoins métiers</w:t>
-      </w:r>
-    </w:p>
-    <w:p>
-      <w:pPr>
-        <w:pStyle w:val="DC4thbullet"/>
-        <w:jc w:val="left"/>
-      </w:pPr>
-      <w:r>
-        <w:rPr>
-          <w:rFonts w:ascii="Arial" w:hAnsi="Arial"/>
-          <w:color w:val="000000"/>
-          <w:sz w:val="20"/>
-        </w:rPr>
-        <w:t>Conception des outils et indicateurs à mettre à disposition</w:t>
-      </w:r>
-    </w:p>
-    <w:p>
-      <w:pPr>
-        <w:pStyle w:val="DC4thbullet"/>
-        <w:jc w:val="left"/>
-      </w:pPr>
-      <w:r>
-        <w:rPr>
-          <w:rFonts w:ascii="Arial" w:hAnsi="Arial"/>
-          <w:color w:val="000000"/>
-          <w:sz w:val="20"/>
-        </w:rPr>
-        <w:t>Correction et optimisation des pipelines de données</w:t>
-      </w:r>
-    </w:p>
-    <w:p>
-      <w:pPr>
-        <w:pStyle w:val="DC4thbullet"/>
-        <w:jc w:val="left"/>
-      </w:pPr>
-      <w:r>
-        <w:rPr>
-          <w:rFonts w:ascii="Arial" w:hAnsi="Arial"/>
-          <w:color w:val="000000"/>
-          <w:sz w:val="20"/>
-        </w:rPr>
-        <w:t>Coordination entre les services</w:t>
-      </w:r>
-    </w:p>
-    <w:p>
-      <w:pPr>
-        <w:pStyle w:val="DC2ndbullet"/>
-        <w:jc w:val="left"/>
-      </w:pPr>
-      <w:r>
-        <w:rPr>
-          <w:rFonts w:ascii="Arial" w:hAnsi="Arial"/>
           <w:b/>
-          <w:color w:val="000000"/>
-          <w:sz w:val="20"/>
         </w:rPr>
         <w:t>Configuration des données R&amp;D et BE :</w:t>
       </w:r>
@@ -2392,110 +1842,66 @@
     <w:p>
       <w:pPr>
         <w:pStyle w:val="DC4thbullet"/>
-        <w:jc w:val="left"/>
+      </w:pPr>
+      <w:r>
+        <w:t>Données techniques produits</w:t>
+      </w:r>
+    </w:p>
+    <w:p>
+      <w:pPr>
+        <w:pStyle w:val="DC4thbullet"/>
+      </w:pPr>
+      <w:r>
+        <w:t>Données commerciales sur ERP</w:t>
+      </w:r>
+    </w:p>
+    <w:p>
+      <w:pPr>
+        <w:pStyle w:val="DC4thbullet"/>
+      </w:pPr>
+      <w:r>
+        <w:t>Gammes</w:t>
+      </w:r>
+    </w:p>
+    <w:p>
+      <w:pPr>
+        <w:pStyle w:val="DC4thbullet"/>
+      </w:pPr>
+      <w:r>
+        <w:t>Nomenclatures…</w:t>
+      </w:r>
+    </w:p>
+    <w:p>
+      <w:pPr>
+        <w:pStyle w:val="DC2ndbullet"/>
+      </w:pPr>
+      <w:r>
+        <w:t>Compréhension et interprétation</w:t>
+      </w:r>
+    </w:p>
+    <w:p>
+      <w:pPr>
+        <w:pStyle w:val="DC2ndbullet"/>
+      </w:pPr>
+      <w:r>
+        <w:t>Homogénéisation</w:t>
+      </w:r>
+    </w:p>
+    <w:p>
+      <w:pPr>
+        <w:pStyle w:val="DC1stbullet"/>
+      </w:pPr>
+      <w:r>
+        <w:t>Automatisation</w:t>
+      </w:r>
+    </w:p>
+    <w:p>
+      <w:pPr>
+        <w:pStyle w:val="DC2ndbullet"/>
       </w:pPr>
       <w:r>
         <w:rPr>
-          <w:rFonts w:ascii="Arial" w:hAnsi="Arial"/>
-          <w:color w:val="000000"/>
-          <w:sz w:val="20"/>
-        </w:rPr>
-        <w:t>Données techniques produits</w:t>
-      </w:r>
-    </w:p>
-    <w:p>
-      <w:pPr>
-        <w:pStyle w:val="DC4thbullet"/>
-        <w:jc w:val="left"/>
-      </w:pPr>
-      <w:r>
-        <w:rPr>
-          <w:rFonts w:ascii="Arial" w:hAnsi="Arial"/>
-          <w:color w:val="000000"/>
-          <w:sz w:val="20"/>
-        </w:rPr>
-        <w:t>Données commerciales sur ERP</w:t>
-      </w:r>
-    </w:p>
-    <w:p>
-      <w:pPr>
-        <w:pStyle w:val="DC4thbullet"/>
-        <w:jc w:val="left"/>
-      </w:pPr>
-      <w:r>
-        <w:rPr>
-          <w:rFonts w:ascii="Arial" w:hAnsi="Arial"/>
-          <w:color w:val="000000"/>
-          <w:sz w:val="20"/>
-        </w:rPr>
-        <w:t>Gammes</w:t>
-      </w:r>
-    </w:p>
-    <w:p>
-      <w:pPr>
-        <w:pStyle w:val="DC4thbullet"/>
-        <w:jc w:val="left"/>
-      </w:pPr>
-      <w:r>
-        <w:rPr>
-          <w:rFonts w:ascii="Arial" w:hAnsi="Arial"/>
-          <w:color w:val="000000"/>
-          <w:sz w:val="20"/>
-        </w:rPr>
-        <w:t>Nomenclatures…</w:t>
-      </w:r>
-    </w:p>
-    <w:p>
-      <w:pPr>
-        <w:pStyle w:val="DC2ndbullet"/>
-        <w:jc w:val="left"/>
-      </w:pPr>
-      <w:r>
-        <w:rPr>
-          <w:rFonts w:ascii="Arial" w:hAnsi="Arial"/>
-          <w:color w:val="000000"/>
-          <w:sz w:val="20"/>
-        </w:rPr>
-        <w:t>Compréhension et interprétation</w:t>
-      </w:r>
-    </w:p>
-    <w:p>
-      <w:pPr>
-        <w:pStyle w:val="DC2ndbullet"/>
-        <w:jc w:val="left"/>
-      </w:pPr>
-      <w:r>
-        <w:rPr>
-          <w:rFonts w:ascii="Arial" w:hAnsi="Arial"/>
-          <w:color w:val="000000"/>
-          <w:sz w:val="20"/>
-        </w:rPr>
-        <w:t>Homogénéisation</w:t>
-      </w:r>
-    </w:p>
-    <w:p>
-      <w:pPr>
-        <w:pStyle w:val="DC1stbullet"/>
-        <w:jc w:val="left"/>
-      </w:pPr>
-      <w:r>
-        <w:rPr>
-          <w:color w:val="EC7C2F"/>
-        </w:rPr>
-        <w:t>Automatisation</w:t>
-      </w:r>
-    </w:p>
-    <w:p>
-      <w:pPr>
-        <w:pStyle w:val="DC2ndbullet"/>
-        <w:jc w:val="left"/>
-      </w:pPr>
-      <w:r>
-        <w:rPr>
-          <w:rFonts w:ascii="Arial" w:hAnsi="Arial"/>
           <w:b/>
-          <w:color w:val="000000"/>
-          <w:sz w:val="20"/>
         </w:rPr>
         <w:t>Construction de pipelines selon le besoin</w:t>
       </w:r>
@@ -2503,14 +1909,10 @@
     <w:p>
       <w:pPr>
         <w:pStyle w:val="DC2ndbullet"/>
-        <w:jc w:val="left"/>
       </w:pPr>
       <w:r>
         <w:rPr>
-          <w:rFonts w:ascii="Arial" w:hAnsi="Arial"/>
           <w:b/>
-          <w:color w:val="000000"/>
-          <w:sz w:val="20"/>
         </w:rPr>
         <w:t>Enrichir et croiser les multiples bases de données</w:t>
       </w:r>
@@ -2518,260 +1920,179 @@
     <w:p>
       <w:pPr>
         <w:pStyle w:val="DC2ndbullet"/>
-        <w:jc w:val="left"/>
+      </w:pPr>
+      <w:r>
+        <w:t>Automatisation :</w:t>
+      </w:r>
+    </w:p>
+    <w:p>
+      <w:pPr>
+        <w:pStyle w:val="DC4thbullet"/>
+      </w:pPr>
+      <w:r>
+        <w:t xml:space="preserve">Collecte des besoins </w:t>
+      </w:r>
+    </w:p>
+    <w:p>
+      <w:pPr>
+        <w:pStyle w:val="DC4thbullet"/>
+      </w:pPr>
+      <w:r>
+        <w:t>Mises à jour données</w:t>
+      </w:r>
+    </w:p>
+    <w:p>
+      <w:pPr>
+        <w:pStyle w:val="DC4thbullet"/>
+      </w:pPr>
+      <w:r>
+        <w:t>Traitement et tri</w:t>
+      </w:r>
+    </w:p>
+    <w:p>
+      <w:pPr>
+        <w:pStyle w:val="DC4thbullet"/>
+      </w:pPr>
+      <w:r>
+        <w:t>Paramétrages</w:t>
+      </w:r>
+    </w:p>
+    <w:p>
+      <w:pPr>
+        <w:pStyle w:val="DC2ndbullet"/>
+      </w:pPr>
+      <w:r>
+        <w:t>Ajustements et paramétrages</w:t>
+      </w:r>
+    </w:p>
+    <w:p>
+      <w:pPr>
+        <w:pStyle w:val="DC2ndbullet"/>
+      </w:pPr>
+      <w:r>
+        <w:t>Détection des défauts, dysfonctionnements, anomalies</w:t>
+      </w:r>
+    </w:p>
+    <w:p>
+      <w:pPr>
+        <w:pStyle w:val="DC2ndbullet"/>
+      </w:pPr>
+      <w:r>
+        <w:t>Proposition de solutions correctives</w:t>
+      </w:r>
+    </w:p>
+    <w:p>
+      <w:pPr>
+        <w:pStyle w:val="DC1stbullet"/>
+      </w:pPr>
+      <w:r>
+        <w:t>Visualisation</w:t>
+      </w:r>
+    </w:p>
+    <w:p>
+      <w:pPr>
+        <w:pStyle w:val="DC2ndbullet"/>
+      </w:pPr>
+      <w:r>
+        <w:t>Construire les différentes datavisualisations pour chaque service</w:t>
+      </w:r>
+    </w:p>
+    <w:p>
+      <w:pPr>
+        <w:pStyle w:val="DC2ndbullet"/>
+      </w:pPr>
+      <w:r>
+        <w:t>Développement de Dashboards PowerBI, Looker dynamiques</w:t>
+      </w:r>
+    </w:p>
+    <w:p>
+      <w:pPr>
+        <w:pStyle w:val="DC2ndbullet"/>
+      </w:pPr>
+      <w:r>
+        <w:t>Recherche et vulgarisation d’indicateurs de performance</w:t>
+      </w:r>
+    </w:p>
+    <w:p>
+      <w:pPr>
+        <w:pStyle w:val="DC2ndbullet"/>
+      </w:pPr>
+      <w:r>
+        <w:t>Support aux cas d’usage et analytiques</w:t>
+      </w:r>
+    </w:p>
+    <w:p>
+      <w:pPr>
+        <w:pStyle w:val="DC2ndbullet"/>
+      </w:pPr>
+      <w:r>
+        <w:t>Référent des données disponibles</w:t>
+      </w:r>
+    </w:p>
+    <w:p>
+      <w:pPr>
+        <w:pStyle w:val="DC2ndbullet"/>
+      </w:pPr>
+      <w:r>
+        <w:t>Intégration et développement de reverse engineering</w:t>
+      </w:r>
+    </w:p>
+    <w:p>
+      <w:pPr>
+        <w:pStyle w:val="DCNormal"/>
+      </w:pPr>
+    </w:p>
+    <w:p>
+      <w:pPr>
+        <w:pStyle w:val="DCXPBlueContent"/>
       </w:pPr>
       <w:r>
         <w:rPr>
-          <w:rFonts w:ascii="Arial" w:hAnsi="Arial"/>
-          <w:color w:val="000000"/>
-          <w:sz w:val="20"/>
-        </w:rPr>
-        <w:t>Automatisation :</w:t>
-      </w:r>
-    </w:p>
-    <w:p>
-      <w:pPr>
-        <w:pStyle w:val="DC4thbullet"/>
-        <w:jc w:val="left"/>
-      </w:pPr>
-      <w:r>
-        <w:rPr>
-          <w:rFonts w:ascii="Arial" w:hAnsi="Arial"/>
-          <w:color w:val="000000"/>
-          <w:sz w:val="20"/>
-        </w:rPr>
-        <w:t xml:space="preserve">Collecte des besoins </w:t>
-      </w:r>
-    </w:p>
-    <w:p>
-      <w:pPr>
-        <w:pStyle w:val="DC4thbullet"/>
-        <w:jc w:val="left"/>
-      </w:pPr>
-      <w:r>
-        <w:rPr>
-          <w:rFonts w:ascii="Arial" w:hAnsi="Arial"/>
-          <w:color w:val="000000"/>
-          <w:sz w:val="20"/>
-        </w:rPr>
-        <w:t>Mises à jour données</w:t>
-      </w:r>
-    </w:p>
-    <w:p>
-      <w:pPr>
-        <w:pStyle w:val="DC4thbullet"/>
-        <w:jc w:val="left"/>
-      </w:pPr>
-      <w:r>
-        <w:rPr>
-          <w:rFonts w:ascii="Arial" w:hAnsi="Arial"/>
-          <w:color w:val="000000"/>
-          <w:sz w:val="20"/>
-        </w:rPr>
-        <w:t>Traitement et tri</w:t>
-      </w:r>
-    </w:p>
-    <w:p>
-      <w:pPr>
-        <w:pStyle w:val="DC4thbullet"/>
-        <w:jc w:val="left"/>
-      </w:pPr>
-      <w:r>
-        <w:rPr>
-          <w:rFonts w:ascii="Arial" w:hAnsi="Arial"/>
-          <w:color w:val="000000"/>
-          <w:sz w:val="20"/>
-        </w:rPr>
-        <w:t>Paramétrages</w:t>
-      </w:r>
-    </w:p>
-    <w:p>
-      <w:pPr>
-        <w:pStyle w:val="DC2ndbullet"/>
-        <w:jc w:val="left"/>
-      </w:pPr>
-      <w:r>
-        <w:rPr>
-          <w:rFonts w:ascii="Arial" w:hAnsi="Arial"/>
-          <w:color w:val="000000"/>
-          <w:sz w:val="20"/>
-        </w:rPr>
-        <w:t>Ajustements et paramétrages</w:t>
-      </w:r>
-    </w:p>
-    <w:p>
-      <w:pPr>
-        <w:pStyle w:val="DC2ndbullet"/>
-        <w:jc w:val="left"/>
-      </w:pPr>
-      <w:r>
-        <w:rPr>
-          <w:rFonts w:ascii="Arial" w:hAnsi="Arial"/>
-          <w:color w:val="000000"/>
-          <w:sz w:val="20"/>
-        </w:rPr>
-        <w:t>Détection des défauts, dysfonctionnements, anomalies</w:t>
-      </w:r>
-    </w:p>
-    <w:p>
-      <w:pPr>
-        <w:pStyle w:val="DC2ndbullet"/>
-        <w:jc w:val="left"/>
-      </w:pPr>
-      <w:r>
-        <w:rPr>
-          <w:rFonts w:ascii="Arial" w:hAnsi="Arial"/>
-          <w:color w:val="000000"/>
-          <w:sz w:val="20"/>
-        </w:rPr>
-        <w:t>Proposition de solutions correctives</w:t>
-      </w:r>
-    </w:p>
-    <w:p>
-      <w:pPr>
-        <w:pStyle w:val="DC1stbullet"/>
-        <w:jc w:val="left"/>
-      </w:pPr>
-      <w:r>
-        <w:rPr>
-          <w:color w:val="EC7C2F"/>
-        </w:rPr>
-        <w:t>Visualisation</w:t>
-      </w:r>
-    </w:p>
-    <w:p>
-      <w:pPr>
-        <w:pStyle w:val="DC2ndbullet"/>
-        <w:jc w:val="left"/>
-      </w:pPr>
-      <w:r>
-        <w:rPr>
-          <w:rFonts w:ascii="Arial" w:hAnsi="Arial"/>
-          <w:color w:val="000000"/>
-          <w:sz w:val="20"/>
-        </w:rPr>
-        <w:t>Construire les différentes datavisualisations pour chaque service</w:t>
-      </w:r>
-    </w:p>
-    <w:p>
-      <w:pPr>
-        <w:pStyle w:val="DC2ndbullet"/>
-        <w:jc w:val="left"/>
-      </w:pPr>
-      <w:r>
-        <w:rPr>
-          <w:rFonts w:ascii="Arial" w:hAnsi="Arial"/>
-          <w:color w:val="000000"/>
-          <w:sz w:val="20"/>
-        </w:rPr>
-        <w:t>Développement de Dashboards PowerBI, Looker dynamiques</w:t>
-      </w:r>
-    </w:p>
-    <w:p>
-      <w:pPr>
-        <w:pStyle w:val="DC2ndbullet"/>
-        <w:jc w:val="left"/>
-      </w:pPr>
-      <w:r>
-        <w:rPr>
-          <w:rFonts w:ascii="Arial" w:hAnsi="Arial"/>
-          <w:color w:val="000000"/>
-          <w:sz w:val="20"/>
-        </w:rPr>
-        <w:t>Recherche et vulgarisation d’indicateurs de performance</w:t>
-      </w:r>
-    </w:p>
-    <w:p>
-      <w:pPr>
-        <w:pStyle w:val="DC2ndbullet"/>
-        <w:jc w:val="left"/>
-      </w:pPr>
-      <w:r>
-        <w:rPr>
-          <w:rFonts w:ascii="Arial" w:hAnsi="Arial"/>
-          <w:color w:val="000000"/>
-          <w:sz w:val="20"/>
-        </w:rPr>
-        <w:t>Support aux cas d’usage et analytiques</w:t>
-      </w:r>
-    </w:p>
-    <w:p>
-      <w:pPr>
-        <w:pStyle w:val="DC2ndbullet"/>
-        <w:jc w:val="left"/>
-      </w:pPr>
-      <w:r>
-        <w:rPr>
-          <w:rFonts w:ascii="Arial" w:hAnsi="Arial"/>
-          <w:color w:val="000000"/>
-          <w:sz w:val="20"/>
-        </w:rPr>
-        <w:t>Référent des données disponibles</w:t>
-      </w:r>
-    </w:p>
-    <w:p>
-      <w:pPr>
-        <w:pStyle w:val="DC2ndbullet"/>
-        <w:jc w:val="left"/>
-      </w:pPr>
-      <w:r>
-        <w:rPr>
-          <w:rFonts w:ascii="Arial" w:hAnsi="Arial"/>
-          <w:color w:val="000000"/>
-          <w:sz w:val="20"/>
-        </w:rPr>
-        <w:t>Intégration et développement de reverse engineering</w:t>
-      </w:r>
-    </w:p>
-    <w:p>
-      <w:pPr>
-        <w:jc w:val="left"/>
-      </w:pPr>
-    </w:p>
-    <w:p>
-      <w:pPr>
-        <w:jc w:val="left"/>
-      </w:pPr>
-      <w:r>
-        <w:rPr>
-          <w:rFonts w:ascii="Arial" w:hAnsi="Arial"/>
           <w:b/>
-          <w:color w:val="538CD4"/>
         </w:rPr>
         <w:t xml:space="preserve">Environnements techniques : </w:t>
       </w:r>
       <w:r>
-        <w:rPr>
-          <w:rFonts w:ascii="Arial" w:hAnsi="Arial"/>
-          <w:color w:val="538CD4"/>
-        </w:rPr>
         <w:t>Power Query, Power BI, Excel, Qlikview, Qliksense, HerculePro, Sage X3, Quable</w:t>
       </w:r>
     </w:p>
     <w:p>
       <w:pPr>
-        <w:jc w:val="left"/>
-      </w:pPr>
-      <w:r>
-        <w:br w:type="page"/>
-      </w:r>
+        <w:pStyle w:val="DCNormal"/>
+      </w:pPr>
     </w:p>
     <w:tbl>
       <w:tblPr>
         <w:tblStyle w:val="Grilledutableau"/>
         <w:tblW w:type="auto" w:w="0"/>
         <w:tblLook w:firstColumn="1" w:firstRow="1" w:lastColumn="0" w:lastRow="0" w:noHBand="0" w:noVBand="1" w:val="04A0"/>
+        <w:tblBorders>
+          <w:top w:val="none" w:sz="0" w:space="0" w:color="auto"/>
+          <w:left w:val="none" w:sz="0" w:space="0" w:color="auto"/>
+          <w:bottom w:val="single" w:sz="10" w:space="0" w:color="000000"/>
+          <w:right w:val="none" w:sz="0" w:space="0" w:color="auto"/>
+          <w:insideH w:val="none" w:sz="0" w:space="0" w:color="auto"/>
+          <w:insideV w:val="none" w:sz="0" w:space="0" w:color="auto"/>
+        </w:tblBorders>
       </w:tblPr>
       <w:tblGrid>
-        <w:gridCol w:w="4986"/>
-        <w:gridCol w:w="4986"/>
+        <w:gridCol w:w="4819"/>
+        <w:gridCol w:w="4819"/>
       </w:tblGrid>
       <w:tr>
+        <w:trPr>
+          <w:trHeight w:val="360"/>
+        </w:trPr>
         <w:tc>
           <w:tcPr>
-            <w:tcW w:type="dxa" w:w="4986"/>
+            <w:tcW w:type="dxa" w:w="6803"/>
+            <w:vAlign w:val="center"/>
           </w:tcPr>
           <w:p>
+            <w:pPr>
+              <w:pStyle w:val="DCXPTitle"/>
+              <w:jc w:val="left"/>
+            </w:pPr>
             <w:r>
               <w:t>Vignobles Bardet, Vignonet</w:t>
             </w:r>
@@ -2779,9 +2100,14 @@
         </w:tc>
         <w:tc>
           <w:tcPr>
-            <w:tcW w:type="dxa" w:w="4986"/>
+            <w:tcW w:type="dxa" w:w="2835"/>
+            <w:vAlign w:val="center"/>
           </w:tcPr>
           <w:p>
+            <w:pPr>
+              <w:pStyle w:val="DCXPDate"/>
+              <w:jc w:val="right"/>
+            </w:pPr>
             <w:r>
               <w:rPr>
                 <w:b/>
@@ -2793,11 +2119,19 @@
         </w:tc>
       </w:tr>
       <w:tr>
+        <w:trPr>
+          <w:trHeight w:val="360"/>
+        </w:trPr>
         <w:tc>
           <w:tcPr>
-            <w:tcW w:type="dxa" w:w="4986"/>
+            <w:tcW w:type="dxa" w:w="6803"/>
+            <w:vAlign w:val="center"/>
           </w:tcPr>
           <w:p>
+            <w:pPr>
+              <w:pStyle w:val="DCXPPoste"/>
+              <w:jc w:val="left"/>
+            </w:pPr>
             <w:r>
               <w:rPr>
                 <w:b/>
@@ -2808,7 +2142,8 @@
         </w:tc>
         <w:tc>
           <w:tcPr>
-            <w:tcW w:type="dxa" w:w="4986"/>
+            <w:tcW w:type="dxa" w:w="2835"/>
+            <w:vAlign w:val="center"/>
           </w:tcPr>
           <w:p/>
         </w:tc>
@@ -2816,145 +2151,95 @@
     </w:tbl>
     <w:p>
       <w:pPr>
+        <w:pStyle w:val="DCNormal"/>
+      </w:pPr>
+    </w:p>
+    <w:p>
+      <w:pPr>
         <w:pStyle w:val="DC1stbullet"/>
-        <w:jc w:val="left"/>
+      </w:pPr>
+      <w:r>
+        <w:t>Chef de Projets web</w:t>
+      </w:r>
+    </w:p>
+    <w:p>
+      <w:pPr>
+        <w:pStyle w:val="DC2ndbullet"/>
+      </w:pPr>
+      <w:r>
+        <w:t>Concevoir un business plan et un cahier des charges de site web</w:t>
+      </w:r>
+    </w:p>
+    <w:p>
+      <w:pPr>
+        <w:pStyle w:val="DC2ndbullet"/>
+      </w:pPr>
+      <w:r>
+        <w:t>Mettre en place les plans de communication</w:t>
+      </w:r>
+    </w:p>
+    <w:p>
+      <w:pPr>
+        <w:pStyle w:val="DC2ndbullet"/>
+      </w:pPr>
+      <w:r>
+        <w:t>Lancer les campagnes SEA, Social Ads et les Emailings</w:t>
+      </w:r>
+    </w:p>
+    <w:p>
+      <w:pPr>
+        <w:pStyle w:val="DC1stbullet"/>
+      </w:pPr>
+      <w:r>
+        <w:t>Webmaster e-commerce</w:t>
+      </w:r>
+    </w:p>
+    <w:p>
+      <w:pPr>
+        <w:pStyle w:val="DC2ndbullet"/>
+      </w:pPr>
+      <w:r>
+        <w:t>Gérer le site e-commerce existant, développer le SEO</w:t>
+      </w:r>
+    </w:p>
+    <w:p>
+      <w:pPr>
+        <w:pStyle w:val="DC2ndbullet"/>
+      </w:pPr>
+      <w:r>
+        <w:t>Intégrer de nouveaux produits</w:t>
+      </w:r>
+    </w:p>
+    <w:p>
+      <w:pPr>
+        <w:pStyle w:val="DC2ndbullet"/>
+      </w:pPr>
+      <w:r>
+        <w:t>Créer les visuels de communication web, print et vidéos</w:t>
+      </w:r>
+    </w:p>
+    <w:p>
+      <w:pPr>
+        <w:pStyle w:val="DCNormal"/>
+      </w:pPr>
+    </w:p>
+    <w:p>
+      <w:pPr>
+        <w:pStyle w:val="DCXPBlueContent"/>
       </w:pPr>
       <w:r>
         <w:rPr>
-          <w:color w:val="EC7C2F"/>
-        </w:rPr>
-        <w:t>Chef de Projets web</w:t>
-      </w:r>
-    </w:p>
-    <w:p>
-      <w:pPr>
-        <w:pStyle w:val="DC2ndbullet"/>
-        <w:jc w:val="left"/>
-      </w:pPr>
-      <w:r>
-        <w:rPr>
-          <w:rFonts w:ascii="Arial" w:hAnsi="Arial"/>
-          <w:color w:val="000000"/>
-          <w:sz w:val="20"/>
-        </w:rPr>
-        <w:t>Concevoir un business plan et un cahier des charges de site web</w:t>
-      </w:r>
-    </w:p>
-    <w:p>
-      <w:pPr>
-        <w:pStyle w:val="DC2ndbullet"/>
-        <w:jc w:val="left"/>
-      </w:pPr>
-      <w:r>
-        <w:rPr>
-          <w:rFonts w:ascii="Arial" w:hAnsi="Arial"/>
-          <w:color w:val="000000"/>
-          <w:sz w:val="20"/>
-        </w:rPr>
-        <w:t>Mettre en place les plans de communication</w:t>
-      </w:r>
-    </w:p>
-    <w:p>
-      <w:pPr>
-        <w:pStyle w:val="DC2ndbullet"/>
-        <w:jc w:val="left"/>
-      </w:pPr>
-      <w:r>
-        <w:rPr>
-          <w:rFonts w:ascii="Arial" w:hAnsi="Arial"/>
-          <w:color w:val="000000"/>
-          <w:sz w:val="20"/>
-        </w:rPr>
-        <w:t>Lancer les campagnes SEA, Social Ads et les Emailings</w:t>
-      </w:r>
-    </w:p>
-    <w:p>
-      <w:pPr>
-        <w:pStyle w:val="DC1stbullet"/>
-        <w:jc w:val="left"/>
-      </w:pPr>
-      <w:r>
-        <w:rPr>
-          <w:color w:val="EC7C2F"/>
-        </w:rPr>
-        <w:t>Webmaster e-commerce</w:t>
-      </w:r>
-    </w:p>
-    <w:p>
-      <w:pPr>
-        <w:pStyle w:val="DC2ndbullet"/>
-        <w:jc w:val="left"/>
-      </w:pPr>
-      <w:r>
-        <w:rPr>
-          <w:rFonts w:ascii="Arial" w:hAnsi="Arial"/>
-          <w:color w:val="000000"/>
-          <w:sz w:val="20"/>
-        </w:rPr>
-        <w:t>Gérer le site e-commerce existant, développer le SEO</w:t>
-      </w:r>
-    </w:p>
-    <w:p>
-      <w:pPr>
-        <w:pStyle w:val="DC2ndbullet"/>
-        <w:jc w:val="left"/>
-      </w:pPr>
-      <w:r>
-        <w:rPr>
-          <w:rFonts w:ascii="Arial" w:hAnsi="Arial"/>
-          <w:color w:val="000000"/>
-          <w:sz w:val="20"/>
-        </w:rPr>
-        <w:t>Intégrer de nouveaux produits</w:t>
-      </w:r>
-    </w:p>
-    <w:p>
-      <w:pPr>
-        <w:pStyle w:val="DC2ndbullet"/>
-        <w:jc w:val="left"/>
-      </w:pPr>
-      <w:r>
-        <w:rPr>
-          <w:rFonts w:ascii="Arial" w:hAnsi="Arial"/>
-          <w:color w:val="000000"/>
-          <w:sz w:val="20"/>
-        </w:rPr>
-        <w:t>Créer les visuels de communication web, print et vidéos</w:t>
-      </w:r>
-    </w:p>
-    <w:p>
-      <w:pPr>
-        <w:jc w:val="left"/>
-      </w:pPr>
-    </w:p>
-    <w:p>
-      <w:pPr>
-        <w:jc w:val="left"/>
-      </w:pPr>
-      <w:r>
-        <w:rPr>
-          <w:rFonts w:ascii="Arial" w:hAnsi="Arial"/>
           <w:b/>
-          <w:color w:val="538CD4"/>
         </w:rPr>
         <w:t xml:space="preserve">Environnements techniques : </w:t>
       </w:r>
       <w:r>
-        <w:rPr>
-          <w:rFonts w:ascii="Arial" w:hAnsi="Arial"/>
-          <w:color w:val="538CD4"/>
-        </w:rPr>
         <w:t>Wordpress, Woocommerce, Illustrator, Mailchimp, Meta Businness Suite, Google Ads</w:t>
       </w:r>
     </w:p>
     <w:p>
       <w:pPr>
-        <w:jc w:val="left"/>
-      </w:pPr>
-    </w:p>
-    <w:p>
-      <w:pPr>
-        <w:jc w:val="left"/>
+        <w:pStyle w:val="DCNormal"/>
       </w:pPr>
     </w:p>
     <w:tbl>
@@ -2962,17 +2247,33 @@
         <w:tblStyle w:val="Grilledutableau"/>
         <w:tblW w:type="auto" w:w="0"/>
         <w:tblLook w:firstColumn="1" w:firstRow="1" w:lastColumn="0" w:lastRow="0" w:noHBand="0" w:noVBand="1" w:val="04A0"/>
+        <w:tblBorders>
+          <w:top w:val="none" w:sz="0" w:space="0" w:color="auto"/>
+          <w:left w:val="none" w:sz="0" w:space="0" w:color="auto"/>
+          <w:bottom w:val="single" w:sz="10" w:space="0" w:color="000000"/>
+          <w:right w:val="none" w:sz="0" w:space="0" w:color="auto"/>
+          <w:insideH w:val="none" w:sz="0" w:space="0" w:color="auto"/>
+          <w:insideV w:val="none" w:sz="0" w:space="0" w:color="auto"/>
+        </w:tblBorders>
       </w:tblPr>
       <w:tblGrid>
-        <w:gridCol w:w="4986"/>
-        <w:gridCol w:w="4986"/>
+        <w:gridCol w:w="4819"/>
+        <w:gridCol w:w="4819"/>
       </w:tblGrid>
       <w:tr>
+        <w:trPr>
+          <w:trHeight w:val="360"/>
+        </w:trPr>
         <w:tc>
           <w:tcPr>
-            <w:tcW w:type="dxa" w:w="4986"/>
+            <w:tcW w:type="dxa" w:w="6803"/>
+            <w:vAlign w:val="center"/>
           </w:tcPr>
           <w:p>
+            <w:pPr>
+              <w:pStyle w:val="DCXPTitle"/>
+              <w:jc w:val="left"/>
+            </w:pPr>
             <w:r>
               <w:t>Actiplay (Klarsen), Bordeaux</w:t>
             </w:r>
@@ -2980,9 +2281,14 @@
         </w:tc>
         <w:tc>
           <w:tcPr>
-            <w:tcW w:type="dxa" w:w="4986"/>
+            <w:tcW w:type="dxa" w:w="2835"/>
+            <w:vAlign w:val="center"/>
           </w:tcPr>
           <w:p>
+            <w:pPr>
+              <w:pStyle w:val="DCXPDate"/>
+              <w:jc w:val="right"/>
+            </w:pPr>
             <w:r>
               <w:rPr>
                 <w:b/>
@@ -2994,11 +2300,19 @@
         </w:tc>
       </w:tr>
       <w:tr>
+        <w:trPr>
+          <w:trHeight w:val="360"/>
+        </w:trPr>
         <w:tc>
           <w:tcPr>
-            <w:tcW w:type="dxa" w:w="4986"/>
+            <w:tcW w:type="dxa" w:w="6803"/>
+            <w:vAlign w:val="center"/>
           </w:tcPr>
           <w:p>
+            <w:pPr>
+              <w:pStyle w:val="DCXPPoste"/>
+              <w:jc w:val="left"/>
+            </w:pPr>
             <w:r>
               <w:rPr>
                 <w:b/>
@@ -3009,7 +2323,8 @@
         </w:tc>
         <w:tc>
           <w:tcPr>
-            <w:tcW w:type="dxa" w:w="4986"/>
+            <w:tcW w:type="dxa" w:w="2835"/>
+            <w:vAlign w:val="center"/>
           </w:tcPr>
           <w:p/>
         </w:tc>
@@ -3017,158 +2332,102 @@
     </w:tbl>
     <w:p>
       <w:pPr>
-        <w:jc w:val="left"/>
+        <w:pStyle w:val="DCNormal"/>
       </w:pPr>
     </w:p>
     <w:p>
       <w:pPr>
         <w:pStyle w:val="DC1stbullet"/>
-        <w:jc w:val="left"/>
+      </w:pPr>
+      <w:r>
+        <w:t>Data Analyst</w:t>
+      </w:r>
+    </w:p>
+    <w:p>
+      <w:pPr>
+        <w:pStyle w:val="DC2ndbullet"/>
+      </w:pPr>
+      <w:r>
+        <w:t>Intégrer les campagnes digitales sur les différents sites web</w:t>
+      </w:r>
+    </w:p>
+    <w:p>
+      <w:pPr>
+        <w:pStyle w:val="DC2ndbullet"/>
+      </w:pPr>
+      <w:r>
+        <w:t>Construire les tableaux de reporting et d'analyse des données utilisateurs issues des campagnes</w:t>
+      </w:r>
+    </w:p>
+    <w:p>
+      <w:pPr>
+        <w:pStyle w:val="DC2ndbullet"/>
+      </w:pPr>
+      <w:r>
+        <w:t>Enrichir et nettoyer les bases de données existantes</w:t>
+      </w:r>
+    </w:p>
+    <w:p>
+      <w:pPr>
+        <w:pStyle w:val="DC1stbullet"/>
+      </w:pPr>
+      <w:r>
+        <w:t>Product Owner</w:t>
+      </w:r>
+    </w:p>
+    <w:p>
+      <w:pPr>
+        <w:pStyle w:val="DC2ndbullet"/>
+      </w:pPr>
+      <w:r>
+        <w:t>Manager le développement d'un projet de logiciel interne de requêtage de base de données</w:t>
+      </w:r>
+    </w:p>
+    <w:p>
+      <w:pPr>
+        <w:pStyle w:val="DC2ndbullet"/>
+      </w:pPr>
+      <w:r>
+        <w:t>Coordonner un Tech Lead et 2 développeurs</w:t>
+      </w:r>
+    </w:p>
+    <w:p>
+      <w:pPr>
+        <w:pStyle w:val="DC2ndbullet"/>
+      </w:pPr>
+      <w:r>
+        <w:t>Recueillir les besoins métiers</w:t>
+      </w:r>
+    </w:p>
+    <w:p>
+      <w:pPr>
+        <w:pStyle w:val="DC2ndbullet"/>
+      </w:pPr>
+      <w:r>
+        <w:t>Construire et mettre à jour le Kanban</w:t>
+      </w:r>
+    </w:p>
+    <w:p>
+      <w:pPr>
+        <w:pStyle w:val="DCNormal"/>
+      </w:pPr>
+    </w:p>
+    <w:p>
+      <w:pPr>
+        <w:pStyle w:val="DCXPBlueContent"/>
       </w:pPr>
       <w:r>
         <w:rPr>
-          <w:color w:val="EC7C2F"/>
-        </w:rPr>
-        <w:t>Data Analyst</w:t>
-      </w:r>
-    </w:p>
-    <w:p>
-      <w:pPr>
-        <w:pStyle w:val="DC2ndbullet"/>
-        <w:jc w:val="left"/>
-      </w:pPr>
-      <w:r>
-        <w:rPr>
-          <w:rFonts w:ascii="Arial" w:hAnsi="Arial"/>
-          <w:color w:val="000000"/>
-          <w:sz w:val="20"/>
-        </w:rPr>
-        <w:t>Intégrer les campagnes digitales sur les différents sites web</w:t>
-      </w:r>
-    </w:p>
-    <w:p>
-      <w:pPr>
-        <w:pStyle w:val="DC2ndbullet"/>
-        <w:jc w:val="left"/>
-      </w:pPr>
-      <w:r>
-        <w:rPr>
-          <w:rFonts w:ascii="Arial" w:hAnsi="Arial"/>
-          <w:color w:val="000000"/>
-          <w:sz w:val="20"/>
-        </w:rPr>
-        <w:t>Construire les tableaux de reporting et d'analyse des données utilisateurs issues des campagnes</w:t>
-      </w:r>
-    </w:p>
-    <w:p>
-      <w:pPr>
-        <w:pStyle w:val="DC2ndbullet"/>
-        <w:jc w:val="left"/>
-      </w:pPr>
-      <w:r>
-        <w:rPr>
-          <w:rFonts w:ascii="Arial" w:hAnsi="Arial"/>
-          <w:color w:val="000000"/>
-          <w:sz w:val="20"/>
-        </w:rPr>
-        <w:t>Enrichir et nettoyer les bases de données existantes</w:t>
-      </w:r>
-    </w:p>
-    <w:p>
-      <w:pPr>
-        <w:pStyle w:val="DC1stbullet"/>
-        <w:jc w:val="left"/>
-      </w:pPr>
-      <w:r>
-        <w:rPr>
-          <w:color w:val="EC7C2F"/>
-        </w:rPr>
-        <w:t>Product Owner</w:t>
-      </w:r>
-    </w:p>
-    <w:p>
-      <w:pPr>
-        <w:pStyle w:val="DC2ndbullet"/>
-        <w:jc w:val="left"/>
-      </w:pPr>
-      <w:r>
-        <w:rPr>
-          <w:rFonts w:ascii="Arial" w:hAnsi="Arial"/>
-          <w:color w:val="000000"/>
-          <w:sz w:val="20"/>
-        </w:rPr>
-        <w:t>Manager le développement d'un projet de logiciel interne de requêtage de base de données</w:t>
-      </w:r>
-    </w:p>
-    <w:p>
-      <w:pPr>
-        <w:pStyle w:val="DC2ndbullet"/>
-        <w:jc w:val="left"/>
-      </w:pPr>
-      <w:r>
-        <w:rPr>
-          <w:rFonts w:ascii="Arial" w:hAnsi="Arial"/>
-          <w:color w:val="000000"/>
-          <w:sz w:val="20"/>
-        </w:rPr>
-        <w:t>Coordonner un Tech Lead et 2 développeurs</w:t>
-      </w:r>
-    </w:p>
-    <w:p>
-      <w:pPr>
-        <w:pStyle w:val="DC2ndbullet"/>
-        <w:jc w:val="left"/>
-      </w:pPr>
-      <w:r>
-        <w:rPr>
-          <w:rFonts w:ascii="Arial" w:hAnsi="Arial"/>
-          <w:color w:val="000000"/>
-          <w:sz w:val="20"/>
-        </w:rPr>
-        <w:t>Recueillir les besoins métiers</w:t>
-      </w:r>
-    </w:p>
-    <w:p>
-      <w:pPr>
-        <w:pStyle w:val="DC2ndbullet"/>
-        <w:jc w:val="left"/>
-      </w:pPr>
-      <w:r>
-        <w:rPr>
-          <w:rFonts w:ascii="Arial" w:hAnsi="Arial"/>
-          <w:color w:val="000000"/>
-          <w:sz w:val="20"/>
-        </w:rPr>
-        <w:t>Construire et mettre à jour le Kanban</w:t>
-      </w:r>
-    </w:p>
-    <w:p>
-      <w:pPr>
-        <w:jc w:val="left"/>
-      </w:pPr>
-    </w:p>
-    <w:p>
-      <w:pPr>
-        <w:jc w:val="left"/>
-      </w:pPr>
-      <w:r>
-        <w:rPr>
-          <w:rFonts w:ascii="Arial" w:hAnsi="Arial"/>
           <w:b/>
-          <w:color w:val="538CD4"/>
         </w:rPr>
         <w:t xml:space="preserve">Environnements techniques : </w:t>
       </w:r>
       <w:r>
-        <w:rPr>
-          <w:rFonts w:ascii="Arial" w:hAnsi="Arial"/>
-          <w:color w:val="538CD4"/>
-        </w:rPr>
         <w:t>Google Analytics, Excel, HTML-CSS, Jira Confluence, MongoDB, Python, Javascript</w:t>
       </w:r>
     </w:p>
     <w:sectPr>
-      <w:pgSz w:w="12240" w:h="15840"/>
+      <w:pgSz w:w="11906" w:h="16838" w:code="9"/>
       <w:pgMar w:top="1134" w:right="1134" w:bottom="1134" w:left="1134" w:header="720" w:footer="720" w:gutter="0"/>
       <w:cols w:space="720"/>
       <w:docGrid w:linePitch="360"/>
@@ -15492,7 +14751,7 @@
     <w:next w:val="DCNormal"/>
     <w:link w:val="DCT1SectionsCar"/>
     <w:qFormat/>
-    <w:rsid w:val="00C87908"/>
+    <w:rsid w:val="00476156"/>
     <w:pPr>
       <w:spacing w:before="120" w:after="120" w:line="240" w:lineRule="auto"/>
       <w:ind w:left="567"/>
@@ -15502,6 +14761,7 @@
       <w:rFonts w:ascii="Arial" w:eastAsiaTheme="majorEastAsia" w:hAnsi="Arial" w:cstheme="majorBidi"/>
       <w:b/>
       <w:bCs/>
+      <w:smallCaps/>
       <w:color w:val="538CD4"/>
       <w:sz w:val="32"/>
       <w:szCs w:val="28"/>
@@ -15509,19 +14769,17 @@
   </w:style>
   <w:style w:type="paragraph" w:customStyle="1" w:styleId="DC1stbullet">
     <w:name w:val="DC_1st_bullet"/>
-    <w:basedOn w:val="DCT1Sections"/>
+    <w:basedOn w:val="DCNormal"/>
     <w:qFormat/>
-    <w:rsid w:val="00F16470"/>
+    <w:rsid w:val="001E2384"/>
     <w:pPr>
-      <w:spacing w:before="0"/>
-      <w:ind w:left="0"/>
       <w:outlineLvl w:val="2"/>
     </w:pPr>
     <w:rPr>
+      <w:b/>
       <w:color w:val="EC7C2F"/>
       <w:sz w:val="24"/>
       <w:szCs w:val="26"/>
-      <w:lang w:val="fr-FR"/>
     </w:rPr>
   </w:style>
   <w:style w:type="paragraph" w:customStyle="1" w:styleId="DCTableBlueTitle">
@@ -15552,7 +14810,7 @@
     <w:name w:val="DC_Table_Year"/>
     <w:basedOn w:val="DCTableContent"/>
     <w:qFormat/>
-    <w:rsid w:val="00ED10F4"/>
+    <w:rsid w:val="009E21FF"/>
     <w:rPr>
       <w:b/>
     </w:rPr>
@@ -15625,11 +14883,12 @@
     <w:name w:val="DC_T1_Sections Car"/>
     <w:basedOn w:val="Policepardfaut"/>
     <w:link w:val="DCT1Sections"/>
-    <w:rsid w:val="00C87908"/>
+    <w:rsid w:val="00476156"/>
     <w:rPr>
       <w:rFonts w:ascii="Arial" w:eastAsiaTheme="majorEastAsia" w:hAnsi="Arial" w:cstheme="majorBidi"/>
       <w:b/>
       <w:bCs/>
+      <w:smallCaps/>
       <w:color w:val="538CD4"/>
       <w:sz w:val="32"/>
       <w:szCs w:val="28"/>
@@ -15666,7 +14925,6 @@
       </w:pBdr>
       <w:ind w:left="993" w:hanging="426"/>
       <w:contextualSpacing/>
-      <w:jc w:val="both"/>
       <w:outlineLvl w:val="9"/>
     </w:pPr>
     <w:rPr>
@@ -15708,7 +14966,7 @@
     <w:name w:val="DC_Table_Content"/>
     <w:basedOn w:val="DCNormal"/>
     <w:qFormat/>
-    <w:rsid w:val="00E7554D"/>
+    <w:rsid w:val="009E21FF"/>
     <w:pPr>
       <w:pBdr>
         <w:top w:val="nil"/>
@@ -15717,7 +14975,8 @@
         <w:right w:val="nil"/>
         <w:between w:val="nil"/>
       </w:pBdr>
-      <w:ind w:left="57"/>
+      <w:spacing w:before="120"/>
+      <w:ind w:left="57" w:right="57"/>
       <w:jc w:val="left"/>
     </w:pPr>
     <w:rPr>
@@ -15728,16 +14987,18 @@
   </w:style>
   <w:style w:type="paragraph" w:customStyle="1" w:styleId="DCXPTitle">
     <w:name w:val="DC_XP_Title"/>
-    <w:basedOn w:val="DCNormal"/>
+    <w:basedOn w:val="DCT1Sections"/>
     <w:qFormat/>
-    <w:rsid w:val="00D07DBB"/>
+    <w:rsid w:val="00476156"/>
     <w:pPr>
-      <w:ind w:left="57"/>
+      <w:spacing w:before="240"/>
+      <w:ind w:left="57" w:right="57"/>
       <w:outlineLvl w:val="1"/>
     </w:pPr>
     <w:rPr>
+      <w:b w:val="0"/>
+      <w:smallCaps w:val="0"/>
       <w:color w:val="808080" w:themeColor="background1" w:themeShade="80"/>
-      <w:sz w:val="32"/>
       <w:szCs w:val="32"/>
     </w:rPr>
   </w:style>
@@ -15745,9 +15006,10 @@
     <w:name w:val="DC_XP_Date"/>
     <w:basedOn w:val="DCNormal"/>
     <w:qFormat/>
-    <w:rsid w:val="00D07DBB"/>
+    <w:rsid w:val="009E21FF"/>
     <w:pPr>
-      <w:ind w:right="57"/>
+      <w:spacing w:before="120"/>
+      <w:ind w:left="57" w:right="57"/>
       <w:jc w:val="right"/>
     </w:pPr>
     <w:rPr>
@@ -15764,9 +15026,10 @@
     <w:name w:val="DC_XP_Poste"/>
     <w:basedOn w:val="DCNormal"/>
     <w:qFormat/>
-    <w:rsid w:val="00D07DBB"/>
+    <w:rsid w:val="009E21FF"/>
     <w:pPr>
-      <w:ind w:left="57"/>
+      <w:spacing w:before="120"/>
+      <w:ind w:left="57" w:right="57"/>
     </w:pPr>
     <w:rPr>
       <w:rFonts w:eastAsia="Arial" w:cs="Arial"/>

</xml_diff>